<commit_message>
back again with cpp
</commit_message>
<xml_diff>
--- a/C++ NOTES/C++ NOTES.docx
+++ b/C++ NOTES/C++ NOTES.docx
@@ -12,6 +12,7 @@
           <w:u w:val="single"/>
         </w:rPr>
       </w:pPr>
+      <w:bookmarkStart w:id="0" w:name="_Hlk221832472"/>
       <w:r>
         <w:rPr>
           <w:b/>
@@ -42,9 +43,20 @@
           <w:szCs w:val="36"/>
           <w:u w:val="single"/>
         </w:rPr>
-        <w:t>PART 1)</w:t>
-      </w:r>
-    </w:p>
+        <w:t>CHAPTER</w:t>
+      </w:r>
+      <w:r>
+        <w:rPr>
+          <w:b/>
+          <w:bCs/>
+          <w:sz w:val="36"/>
+          <w:szCs w:val="36"/>
+          <w:u w:val="single"/>
+        </w:rPr>
+        <w:t xml:space="preserve"> 1)</w:t>
+      </w:r>
+    </w:p>
+    <w:bookmarkEnd w:id="0"/>
     <w:p>
       <w:pPr>
         <w:rPr>
@@ -742,7 +754,7 @@
     <w:p>
       <w:r>
         <w:pict w14:anchorId="0400826B">
-          <v:rect id="_x0000_i1049" style="width:0;height:1.5pt" o:hralign="center" o:hrstd="t" o:hr="t" fillcolor="#a0a0a0" stroked="f"/>
+          <v:rect id="_x0000_i1025" style="width:0;height:1.5pt" o:hralign="center" o:hrstd="t" o:hr="t" fillcolor="#a0a0a0" stroked="f"/>
         </w:pict>
       </w:r>
     </w:p>
@@ -1271,7 +1283,7 @@
     <w:p>
       <w:r>
         <w:pict w14:anchorId="2297FEAA">
-          <v:rect id="_x0000_i1050" style="width:0;height:1.5pt" o:hralign="center" o:hrstd="t" o:hr="t" fillcolor="#a0a0a0" stroked="f"/>
+          <v:rect id="_x0000_i1026" style="width:0;height:1.5pt" o:hralign="center" o:hrstd="t" o:hr="t" fillcolor="#a0a0a0" stroked="f"/>
         </w:pict>
       </w:r>
     </w:p>
@@ -1677,7 +1689,7 @@
     <w:p>
       <w:r>
         <w:pict w14:anchorId="3C1197A6">
-          <v:rect id="_x0000_i1051" style="width:0;height:1.5pt" o:hralign="center" o:hrstd="t" o:hr="t" fillcolor="#a0a0a0" stroked="f"/>
+          <v:rect id="_x0000_i1027" style="width:0;height:1.5pt" o:hralign="center" o:hrstd="t" o:hr="t" fillcolor="#a0a0a0" stroked="f"/>
         </w:pict>
       </w:r>
     </w:p>
@@ -1958,22 +1970,91 @@
     <w:p>
       <w:r>
         <w:pict w14:anchorId="09F3979F">
-          <v:rect id="_x0000_i1052" style="width:0;height:1.5pt" o:hralign="center" o:hrstd="t" o:hr="t" fillcolor="#a0a0a0" stroked="f"/>
+          <v:rect id="_x0000_i1028" style="width:0;height:1.5pt" o:hralign="center" o:hrstd="t" o:hr="t" fillcolor="#a0a0a0" stroked="f"/>
         </w:pict>
       </w:r>
     </w:p>
     <w:p>
-      <w:pPr>
-        <w:rPr>
-          <w:b/>
-          <w:bCs/>
-        </w:rPr>
-      </w:pPr>
-      <w:r>
-        <w:rPr>
-          <w:b/>
-          <w:bCs/>
-        </w:rPr>
+      <w:r>
+        <w:drawing>
+          <wp:inline distT="0" distB="0" distL="0" distR="0" wp14:anchorId="699B5250" wp14:editId="512C0378">
+            <wp:extent cx="5731510" cy="2403475"/>
+            <wp:effectExtent l="0" t="0" r="2540" b="0"/>
+            <wp:docPr id="1376857438" name="Picture 1"/>
+            <wp:cNvGraphicFramePr>
+              <a:graphicFrameLocks xmlns:a="http://schemas.openxmlformats.org/drawingml/2006/main" noChangeAspect="1"/>
+            </wp:cNvGraphicFramePr>
+            <a:graphic xmlns:a="http://schemas.openxmlformats.org/drawingml/2006/main">
+              <a:graphicData uri="http://schemas.openxmlformats.org/drawingml/2006/picture">
+                <pic:pic xmlns:pic="http://schemas.openxmlformats.org/drawingml/2006/picture">
+                  <pic:nvPicPr>
+                    <pic:cNvPr id="1376857438" name=""/>
+                    <pic:cNvPicPr/>
+                  </pic:nvPicPr>
+                  <pic:blipFill>
+                    <a:blip r:embed="rId5"/>
+                    <a:stretch>
+                      <a:fillRect/>
+                    </a:stretch>
+                  </pic:blipFill>
+                  <pic:spPr>
+                    <a:xfrm>
+                      <a:off x="0" y="0"/>
+                      <a:ext cx="5731510" cy="2403475"/>
+                    </a:xfrm>
+                    <a:prstGeom prst="rect">
+                      <a:avLst/>
+                    </a:prstGeom>
+                  </pic:spPr>
+                </pic:pic>
+              </a:graphicData>
+            </a:graphic>
+          </wp:inline>
+        </w:drawing>
+      </w:r>
+    </w:p>
+    <w:p>
+      <w:pPr>
+        <w:rPr>
+          <w:b/>
+          <w:bCs/>
+        </w:rPr>
+      </w:pPr>
+      <w:r>
+        <w:pict w14:anchorId="33E53BBB">
+          <v:rect id="_x0000_i1032" style="width:0;height:1.5pt" o:hralign="center" o:hrstd="t" o:hr="t" fillcolor="#a0a0a0" stroked="f"/>
+        </w:pict>
+      </w:r>
+    </w:p>
+    <w:p>
+      <w:pPr>
+        <w:rPr>
+          <w:b/>
+          <w:bCs/>
+        </w:rPr>
+      </w:pPr>
+    </w:p>
+    <w:p>
+      <w:pPr>
+        <w:rPr>
+          <w:b/>
+          <w:bCs/>
+        </w:rPr>
+      </w:pPr>
+    </w:p>
+    <w:p>
+      <w:pPr>
+        <w:rPr>
+          <w:b/>
+          <w:bCs/>
+        </w:rPr>
+      </w:pPr>
+      <w:r>
+        <w:rPr>
+          <w:b/>
+          <w:bCs/>
+        </w:rPr>
+        <w:lastRenderedPageBreak/>
         <w:t>5. Setup &amp; Practical (How to Run?)</w:t>
       </w:r>
     </w:p>
@@ -2317,7 +2398,3033 @@
         <w:t>.</w:t>
       </w:r>
     </w:p>
-    <w:p/>
+    <w:p>
+      <w:r>
+        <w:pict w14:anchorId="44D14593">
+          <v:rect id="_x0000_i1029" style="width:0;height:1.5pt" o:hralign="center" o:hrstd="t" o:hr="t" fillcolor="#a0a0a0" stroked="f"/>
+        </w:pict>
+      </w:r>
+    </w:p>
+    <w:p>
+      <w:r>
+        <w:drawing>
+          <wp:inline distT="0" distB="0" distL="0" distR="0" wp14:anchorId="6D413A70" wp14:editId="7A6BC828">
+            <wp:extent cx="5706271" cy="2286319"/>
+            <wp:effectExtent l="0" t="0" r="8890" b="0"/>
+            <wp:docPr id="2086263718" name="Picture 1"/>
+            <wp:cNvGraphicFramePr>
+              <a:graphicFrameLocks xmlns:a="http://schemas.openxmlformats.org/drawingml/2006/main" noChangeAspect="1"/>
+            </wp:cNvGraphicFramePr>
+            <a:graphic xmlns:a="http://schemas.openxmlformats.org/drawingml/2006/main">
+              <a:graphicData uri="http://schemas.openxmlformats.org/drawingml/2006/picture">
+                <pic:pic xmlns:pic="http://schemas.openxmlformats.org/drawingml/2006/picture">
+                  <pic:nvPicPr>
+                    <pic:cNvPr id="2086263718" name=""/>
+                    <pic:cNvPicPr/>
+                  </pic:nvPicPr>
+                  <pic:blipFill>
+                    <a:blip r:embed="rId6"/>
+                    <a:stretch>
+                      <a:fillRect/>
+                    </a:stretch>
+                  </pic:blipFill>
+                  <pic:spPr>
+                    <a:xfrm>
+                      <a:off x="0" y="0"/>
+                      <a:ext cx="5706271" cy="2286319"/>
+                    </a:xfrm>
+                    <a:prstGeom prst="rect">
+                      <a:avLst/>
+                    </a:prstGeom>
+                  </pic:spPr>
+                </pic:pic>
+              </a:graphicData>
+            </a:graphic>
+          </wp:inline>
+        </w:drawing>
+      </w:r>
+    </w:p>
+    <w:p>
+      <w:pPr>
+        <w:pStyle w:val="ListParagraph"/>
+        <w:numPr>
+          <w:ilvl w:val="0"/>
+          <w:numId w:val="6"/>
+        </w:numPr>
+      </w:pPr>
+      <w:r>
+        <w:rPr>
+          <w:b/>
+          <w:bCs/>
+        </w:rPr>
+        <w:t>#include &lt;iostream&gt;:</w:t>
+      </w:r>
+      <w:r>
+        <w:t xml:space="preserve"> Iske </w:t>
+      </w:r>
+      <w:proofErr w:type="spellStart"/>
+      <w:r>
+        <w:t>bina</w:t>
+      </w:r>
+      <w:proofErr w:type="spellEnd"/>
+      <w:r>
+        <w:t xml:space="preserve"> </w:t>
+      </w:r>
+      <w:proofErr w:type="spellStart"/>
+      <w:r>
+        <w:t>aap</w:t>
+      </w:r>
+      <w:proofErr w:type="spellEnd"/>
+      <w:r>
+        <w:t xml:space="preserve"> </w:t>
+      </w:r>
+      <w:proofErr w:type="spellStart"/>
+      <w:r>
+        <w:t>cout</w:t>
+      </w:r>
+      <w:proofErr w:type="spellEnd"/>
+      <w:r>
+        <w:t xml:space="preserve"> (print) </w:t>
+      </w:r>
+      <w:proofErr w:type="spellStart"/>
+      <w:r>
+        <w:t>ya</w:t>
+      </w:r>
+      <w:proofErr w:type="spellEnd"/>
+      <w:r>
+        <w:t xml:space="preserve"> </w:t>
+      </w:r>
+      <w:proofErr w:type="spellStart"/>
+      <w:r>
+        <w:t>cin</w:t>
+      </w:r>
+      <w:proofErr w:type="spellEnd"/>
+      <w:r>
+        <w:t xml:space="preserve"> (input) use </w:t>
+      </w:r>
+      <w:proofErr w:type="spellStart"/>
+      <w:r>
+        <w:t>nahi</w:t>
+      </w:r>
+      <w:proofErr w:type="spellEnd"/>
+      <w:r>
+        <w:t xml:space="preserve"> </w:t>
+      </w:r>
+      <w:proofErr w:type="spellStart"/>
+      <w:r>
+        <w:t>kar</w:t>
+      </w:r>
+      <w:proofErr w:type="spellEnd"/>
+      <w:r>
+        <w:t xml:space="preserve"> </w:t>
+      </w:r>
+      <w:proofErr w:type="spellStart"/>
+      <w:r>
+        <w:t>sakte</w:t>
+      </w:r>
+      <w:proofErr w:type="spellEnd"/>
+      <w:r>
+        <w:t>.</w:t>
+      </w:r>
+    </w:p>
+    <w:p>
+      <w:pPr>
+        <w:pStyle w:val="ListParagraph"/>
+        <w:numPr>
+          <w:ilvl w:val="0"/>
+          <w:numId w:val="6"/>
+        </w:numPr>
+      </w:pPr>
+      <w:r>
+        <w:rPr>
+          <w:b/>
+          <w:bCs/>
+        </w:rPr>
+        <w:t xml:space="preserve">Semi-colon </w:t>
+      </w:r>
+      <w:proofErr w:type="gramStart"/>
+      <w:r>
+        <w:rPr>
+          <w:b/>
+          <w:bCs/>
+        </w:rPr>
+        <w:t>( ;</w:t>
+      </w:r>
+      <w:proofErr w:type="gramEnd"/>
+      <w:r>
+        <w:rPr>
+          <w:b/>
+          <w:bCs/>
+        </w:rPr>
+        <w:t xml:space="preserve"> ):</w:t>
+      </w:r>
+      <w:r>
+        <w:t xml:space="preserve"> C++ </w:t>
+      </w:r>
+      <w:proofErr w:type="spellStart"/>
+      <w:r>
+        <w:t>mein</w:t>
+      </w:r>
+      <w:proofErr w:type="spellEnd"/>
+      <w:r>
+        <w:t xml:space="preserve"> </w:t>
+      </w:r>
+      <w:proofErr w:type="spellStart"/>
+      <w:r>
+        <w:t>har</w:t>
+      </w:r>
+      <w:proofErr w:type="spellEnd"/>
+      <w:r>
+        <w:t xml:space="preserve"> statement </w:t>
+      </w:r>
+      <w:proofErr w:type="spellStart"/>
+      <w:r>
+        <w:t>ke</w:t>
+      </w:r>
+      <w:proofErr w:type="spellEnd"/>
+      <w:r>
+        <w:t xml:space="preserve"> </w:t>
+      </w:r>
+      <w:proofErr w:type="spellStart"/>
+      <w:proofErr w:type="gramStart"/>
+      <w:r>
+        <w:t>baad</w:t>
+      </w:r>
+      <w:proofErr w:type="spellEnd"/>
+      <w:r>
+        <w:t xml:space="preserve"> ;</w:t>
+      </w:r>
+      <w:proofErr w:type="gramEnd"/>
+      <w:r>
+        <w:t xml:space="preserve"> </w:t>
+      </w:r>
+      <w:proofErr w:type="spellStart"/>
+      <w:r>
+        <w:t>lagana</w:t>
+      </w:r>
+      <w:proofErr w:type="spellEnd"/>
+      <w:r>
+        <w:t xml:space="preserve"> compulsory </w:t>
+      </w:r>
+      <w:proofErr w:type="spellStart"/>
+      <w:r>
+        <w:t>hai</w:t>
+      </w:r>
+      <w:proofErr w:type="spellEnd"/>
+      <w:r>
+        <w:t xml:space="preserve">, varna compiler </w:t>
+      </w:r>
+      <w:proofErr w:type="spellStart"/>
+      <w:r>
+        <w:t>gussa</w:t>
+      </w:r>
+      <w:proofErr w:type="spellEnd"/>
+      <w:r>
+        <w:t xml:space="preserve"> </w:t>
+      </w:r>
+      <w:proofErr w:type="spellStart"/>
+      <w:r>
+        <w:t>ho</w:t>
+      </w:r>
+      <w:proofErr w:type="spellEnd"/>
+      <w:r>
+        <w:t xml:space="preserve"> </w:t>
+      </w:r>
+      <w:proofErr w:type="spellStart"/>
+      <w:r>
+        <w:t>jayega</w:t>
+      </w:r>
+      <w:proofErr w:type="spellEnd"/>
+      <w:r>
+        <w:t>.</w:t>
+      </w:r>
+    </w:p>
+    <w:p>
+      <w:pPr>
+        <w:pStyle w:val="ListParagraph"/>
+        <w:numPr>
+          <w:ilvl w:val="0"/>
+          <w:numId w:val="6"/>
+        </w:numPr>
+      </w:pPr>
+      <w:r>
+        <w:rPr>
+          <w:b/>
+          <w:bCs/>
+        </w:rPr>
+        <w:t>using namespace std:</w:t>
+      </w:r>
+      <w:r>
+        <w:t xml:space="preserve"> Ye shortcut </w:t>
+      </w:r>
+      <w:proofErr w:type="spellStart"/>
+      <w:r>
+        <w:t>hai</w:t>
+      </w:r>
+      <w:proofErr w:type="spellEnd"/>
+      <w:r>
+        <w:t xml:space="preserve">, </w:t>
+      </w:r>
+      <w:proofErr w:type="spellStart"/>
+      <w:r>
+        <w:t>taaki</w:t>
+      </w:r>
+      <w:proofErr w:type="spellEnd"/>
+      <w:r>
+        <w:t xml:space="preserve"> </w:t>
+      </w:r>
+      <w:proofErr w:type="spellStart"/>
+      <w:r>
+        <w:t>humein</w:t>
+      </w:r>
+      <w:proofErr w:type="spellEnd"/>
+      <w:r>
+        <w:t xml:space="preserve"> </w:t>
+      </w:r>
+      <w:proofErr w:type="spellStart"/>
+      <w:r>
+        <w:t>har</w:t>
+      </w:r>
+      <w:proofErr w:type="spellEnd"/>
+      <w:r>
+        <w:t xml:space="preserve"> </w:t>
+      </w:r>
+      <w:proofErr w:type="spellStart"/>
+      <w:r>
+        <w:t>baar</w:t>
+      </w:r>
+      <w:proofErr w:type="spellEnd"/>
+      <w:r>
+        <w:t xml:space="preserve"> </w:t>
+      </w:r>
+      <w:proofErr w:type="gramStart"/>
+      <w:r>
+        <w:t>std::</w:t>
+      </w:r>
+      <w:proofErr w:type="spellStart"/>
+      <w:proofErr w:type="gramEnd"/>
+      <w:r>
+        <w:t>cout</w:t>
+      </w:r>
+      <w:proofErr w:type="spellEnd"/>
+      <w:r>
+        <w:t xml:space="preserve"> </w:t>
+      </w:r>
+      <w:proofErr w:type="spellStart"/>
+      <w:r>
+        <w:t>na</w:t>
+      </w:r>
+      <w:proofErr w:type="spellEnd"/>
+      <w:r>
+        <w:t xml:space="preserve"> </w:t>
+      </w:r>
+      <w:proofErr w:type="spellStart"/>
+      <w:r>
+        <w:t>likhna</w:t>
+      </w:r>
+      <w:proofErr w:type="spellEnd"/>
+      <w:r>
+        <w:t xml:space="preserve"> </w:t>
+      </w:r>
+      <w:proofErr w:type="spellStart"/>
+      <w:r>
+        <w:t>pade</w:t>
+      </w:r>
+      <w:proofErr w:type="spellEnd"/>
+      <w:r>
+        <w:t>.</w:t>
+      </w:r>
+    </w:p>
+    <w:p>
+      <w:r>
+        <w:pict w14:anchorId="768734E4">
+          <v:rect id="_x0000_i1030" style="width:0;height:1.5pt" o:hralign="center" o:hrstd="t" o:hr="t" fillcolor="#a0a0a0" stroked="f"/>
+        </w:pict>
+      </w:r>
+    </w:p>
+    <w:p>
+      <w:r>
+        <w:rPr>
+          <w:b/>
+          <w:bCs/>
+        </w:rPr>
+        <w:t>Extra Insight for Game Dev:</w:t>
+      </w:r>
+      <w:r>
+        <w:t xml:space="preserve"> C++ </w:t>
+      </w:r>
+      <w:proofErr w:type="spellStart"/>
+      <w:r>
+        <w:t>seekhne</w:t>
+      </w:r>
+      <w:proofErr w:type="spellEnd"/>
+      <w:r>
+        <w:t xml:space="preserve"> ka </w:t>
+      </w:r>
+      <w:proofErr w:type="spellStart"/>
+      <w:r>
+        <w:t>sabse</w:t>
+      </w:r>
+      <w:proofErr w:type="spellEnd"/>
+      <w:r>
+        <w:t xml:space="preserve"> </w:t>
+      </w:r>
+      <w:proofErr w:type="spellStart"/>
+      <w:r>
+        <w:t>bada</w:t>
+      </w:r>
+      <w:proofErr w:type="spellEnd"/>
+      <w:r>
+        <w:t xml:space="preserve"> </w:t>
+      </w:r>
+      <w:proofErr w:type="spellStart"/>
+      <w:r>
+        <w:t>fayda</w:t>
+      </w:r>
+      <w:proofErr w:type="spellEnd"/>
+      <w:r>
+        <w:t xml:space="preserve"> ye </w:t>
+      </w:r>
+      <w:proofErr w:type="spellStart"/>
+      <w:r>
+        <w:t>hai</w:t>
+      </w:r>
+      <w:proofErr w:type="spellEnd"/>
+      <w:r>
+        <w:t xml:space="preserve"> ki </w:t>
+      </w:r>
+      <w:proofErr w:type="spellStart"/>
+      <w:r>
+        <w:t>tumhein</w:t>
+      </w:r>
+      <w:proofErr w:type="spellEnd"/>
+      <w:r>
+        <w:t xml:space="preserve"> </w:t>
+      </w:r>
+      <w:r>
+        <w:rPr>
+          <w:b/>
+          <w:bCs/>
+        </w:rPr>
+        <w:t>Memory Reference</w:t>
+      </w:r>
+      <w:r>
+        <w:t xml:space="preserve"> ki </w:t>
+      </w:r>
+      <w:proofErr w:type="spellStart"/>
+      <w:r>
+        <w:t>samajh</w:t>
+      </w:r>
+      <w:proofErr w:type="spellEnd"/>
+      <w:r>
+        <w:t xml:space="preserve"> aa </w:t>
+      </w:r>
+      <w:proofErr w:type="spellStart"/>
+      <w:r>
+        <w:t>jayegi</w:t>
+      </w:r>
+      <w:proofErr w:type="spellEnd"/>
+      <w:r>
+        <w:t xml:space="preserve">. Jab tum Unity </w:t>
+      </w:r>
+      <w:proofErr w:type="spellStart"/>
+      <w:r>
+        <w:t>ke</w:t>
+      </w:r>
+      <w:proofErr w:type="spellEnd"/>
+      <w:r>
+        <w:t xml:space="preserve"> </w:t>
+      </w:r>
+      <w:proofErr w:type="spellStart"/>
+      <w:r>
+        <w:t>liye</w:t>
+      </w:r>
+      <w:proofErr w:type="spellEnd"/>
+      <w:r>
+        <w:t xml:space="preserve"> C# </w:t>
+      </w:r>
+      <w:proofErr w:type="spellStart"/>
+      <w:r>
+        <w:t>ya</w:t>
+      </w:r>
+      <w:proofErr w:type="spellEnd"/>
+      <w:r>
+        <w:t xml:space="preserve"> Unreal </w:t>
+      </w:r>
+      <w:proofErr w:type="spellStart"/>
+      <w:r>
+        <w:t>ke</w:t>
+      </w:r>
+      <w:proofErr w:type="spellEnd"/>
+      <w:r>
+        <w:t xml:space="preserve"> </w:t>
+      </w:r>
+      <w:proofErr w:type="spellStart"/>
+      <w:r>
+        <w:t>liye</w:t>
+      </w:r>
+      <w:proofErr w:type="spellEnd"/>
+      <w:r>
+        <w:t xml:space="preserve"> C++ </w:t>
+      </w:r>
+      <w:proofErr w:type="spellStart"/>
+      <w:r>
+        <w:t>karoge</w:t>
+      </w:r>
+      <w:proofErr w:type="spellEnd"/>
+      <w:r>
+        <w:t xml:space="preserve">, </w:t>
+      </w:r>
+      <w:proofErr w:type="spellStart"/>
+      <w:r>
+        <w:t>toh</w:t>
+      </w:r>
+      <w:proofErr w:type="spellEnd"/>
+      <w:r>
+        <w:t xml:space="preserve"> </w:t>
+      </w:r>
+      <w:proofErr w:type="spellStart"/>
+      <w:r>
+        <w:t>tumhein</w:t>
+      </w:r>
+      <w:proofErr w:type="spellEnd"/>
+      <w:r>
+        <w:t xml:space="preserve"> </w:t>
+      </w:r>
+      <w:proofErr w:type="spellStart"/>
+      <w:r>
+        <w:t>pata</w:t>
+      </w:r>
+      <w:proofErr w:type="spellEnd"/>
+      <w:r>
+        <w:t xml:space="preserve"> </w:t>
+      </w:r>
+      <w:proofErr w:type="spellStart"/>
+      <w:r>
+        <w:t>hoga</w:t>
+      </w:r>
+      <w:proofErr w:type="spellEnd"/>
+      <w:r>
+        <w:t xml:space="preserve"> ki variable </w:t>
+      </w:r>
+      <w:proofErr w:type="spellStart"/>
+      <w:r>
+        <w:t>piche</w:t>
+      </w:r>
+      <w:proofErr w:type="spellEnd"/>
+      <w:r>
+        <w:t xml:space="preserve"> RAM </w:t>
+      </w:r>
+      <w:proofErr w:type="spellStart"/>
+      <w:r>
+        <w:t>mein</w:t>
+      </w:r>
+      <w:proofErr w:type="spellEnd"/>
+      <w:r>
+        <w:t xml:space="preserve"> </w:t>
+      </w:r>
+      <w:proofErr w:type="spellStart"/>
+      <w:r>
+        <w:t>kaise</w:t>
+      </w:r>
+      <w:proofErr w:type="spellEnd"/>
+      <w:r>
+        <w:t xml:space="preserve"> store </w:t>
+      </w:r>
+      <w:proofErr w:type="spellStart"/>
+      <w:r>
+        <w:t>ho</w:t>
+      </w:r>
+      <w:proofErr w:type="spellEnd"/>
+      <w:r>
+        <w:t xml:space="preserve"> </w:t>
+      </w:r>
+      <w:proofErr w:type="spellStart"/>
+      <w:r>
+        <w:t>raha</w:t>
+      </w:r>
+      <w:proofErr w:type="spellEnd"/>
+      <w:r>
+        <w:t xml:space="preserve"> </w:t>
+      </w:r>
+      <w:proofErr w:type="spellStart"/>
+      <w:r>
+        <w:t>hai</w:t>
+      </w:r>
+      <w:proofErr w:type="spellEnd"/>
+      <w:r>
+        <w:t xml:space="preserve">. Isse </w:t>
+      </w:r>
+      <w:proofErr w:type="spellStart"/>
+      <w:r>
+        <w:t>tumhare</w:t>
+      </w:r>
+      <w:proofErr w:type="spellEnd"/>
+      <w:r>
+        <w:t xml:space="preserve"> games "lag-free" </w:t>
+      </w:r>
+      <w:proofErr w:type="spellStart"/>
+      <w:r>
+        <w:t>banenge</w:t>
+      </w:r>
+      <w:proofErr w:type="spellEnd"/>
+      <w:r>
+        <w:t>!</w:t>
+      </w:r>
+      <w:r>
+        <w:pict w14:anchorId="4EB13B0C">
+          <v:rect id="_x0000_i1031" style="width:0;height:1.5pt" o:hralign="center" o:hrstd="t" o:hr="t" fillcolor="#a0a0a0" stroked="f"/>
+        </w:pict>
+      </w:r>
+    </w:p>
+    <w:p>
+      <w:pPr>
+        <w:rPr>
+          <w:b/>
+          <w:bCs/>
+          <w:sz w:val="36"/>
+          <w:szCs w:val="36"/>
+          <w:u w:val="single"/>
+        </w:rPr>
+      </w:pPr>
+      <w:r>
+        <w:rPr>
+          <w:b/>
+          <w:bCs/>
+          <w:sz w:val="36"/>
+          <w:szCs w:val="36"/>
+          <w:u w:val="single"/>
+        </w:rPr>
+        <w:lastRenderedPageBreak/>
+        <w:t xml:space="preserve">C++ </w:t>
+      </w:r>
+      <w:proofErr w:type="gramStart"/>
+      <w:r>
+        <w:rPr>
+          <w:b/>
+          <w:bCs/>
+          <w:sz w:val="36"/>
+          <w:szCs w:val="36"/>
+          <w:u w:val="single"/>
+        </w:rPr>
+        <w:t>NOTES(</w:t>
+      </w:r>
+      <w:proofErr w:type="gramEnd"/>
+      <w:r>
+        <w:rPr>
+          <w:b/>
+          <w:bCs/>
+          <w:sz w:val="36"/>
+          <w:szCs w:val="36"/>
+          <w:u w:val="single"/>
+        </w:rPr>
+        <w:t>CHAPTER</w:t>
+      </w:r>
+      <w:r>
+        <w:rPr>
+          <w:b/>
+          <w:bCs/>
+          <w:sz w:val="36"/>
+          <w:szCs w:val="36"/>
+          <w:u w:val="single"/>
+        </w:rPr>
+        <w:t xml:space="preserve"> </w:t>
+      </w:r>
+      <w:r>
+        <w:rPr>
+          <w:b/>
+          <w:bCs/>
+          <w:sz w:val="36"/>
+          <w:szCs w:val="36"/>
+          <w:u w:val="single"/>
+        </w:rPr>
+        <w:t>2)</w:t>
+      </w:r>
+    </w:p>
+    <w:p>
+      <w:r>
+        <w:drawing>
+          <wp:inline distT="0" distB="0" distL="0" distR="0" wp14:anchorId="6C125F1C" wp14:editId="20BF8A9E">
+            <wp:extent cx="5731510" cy="3509010"/>
+            <wp:effectExtent l="0" t="0" r="2540" b="0"/>
+            <wp:docPr id="1620555671" name="Picture 1"/>
+            <wp:cNvGraphicFramePr>
+              <a:graphicFrameLocks xmlns:a="http://schemas.openxmlformats.org/drawingml/2006/main" noChangeAspect="1"/>
+            </wp:cNvGraphicFramePr>
+            <a:graphic xmlns:a="http://schemas.openxmlformats.org/drawingml/2006/main">
+              <a:graphicData uri="http://schemas.openxmlformats.org/drawingml/2006/picture">
+                <pic:pic xmlns:pic="http://schemas.openxmlformats.org/drawingml/2006/picture">
+                  <pic:nvPicPr>
+                    <pic:cNvPr id="1620555671" name=""/>
+                    <pic:cNvPicPr/>
+                  </pic:nvPicPr>
+                  <pic:blipFill>
+                    <a:blip r:embed="rId7"/>
+                    <a:stretch>
+                      <a:fillRect/>
+                    </a:stretch>
+                  </pic:blipFill>
+                  <pic:spPr>
+                    <a:xfrm>
+                      <a:off x="0" y="0"/>
+                      <a:ext cx="5731510" cy="3509010"/>
+                    </a:xfrm>
+                    <a:prstGeom prst="rect">
+                      <a:avLst/>
+                    </a:prstGeom>
+                  </pic:spPr>
+                </pic:pic>
+              </a:graphicData>
+            </a:graphic>
+          </wp:inline>
+        </w:drawing>
+      </w:r>
+    </w:p>
+    <w:p>
+      <w:r>
+        <w:t xml:space="preserve">C++ ka </w:t>
+      </w:r>
+      <w:proofErr w:type="spellStart"/>
+      <w:r>
+        <w:t>har</w:t>
+      </w:r>
+      <w:proofErr w:type="spellEnd"/>
+      <w:r>
+        <w:t xml:space="preserve"> program ek specific </w:t>
+      </w:r>
+      <w:proofErr w:type="spellStart"/>
+      <w:r>
+        <w:t>dhanchay</w:t>
+      </w:r>
+      <w:proofErr w:type="spellEnd"/>
+      <w:r>
+        <w:t xml:space="preserve"> (structure) </w:t>
+      </w:r>
+      <w:proofErr w:type="spellStart"/>
+      <w:r>
+        <w:t>mein</w:t>
+      </w:r>
+      <w:proofErr w:type="spellEnd"/>
+      <w:r>
+        <w:t xml:space="preserve"> </w:t>
+      </w:r>
+      <w:proofErr w:type="spellStart"/>
+      <w:r>
+        <w:t>likha</w:t>
+      </w:r>
+      <w:proofErr w:type="spellEnd"/>
+      <w:r>
+        <w:t xml:space="preserve"> </w:t>
+      </w:r>
+      <w:proofErr w:type="spellStart"/>
+      <w:r>
+        <w:t>jata</w:t>
+      </w:r>
+      <w:proofErr w:type="spellEnd"/>
+      <w:r>
+        <w:t xml:space="preserve"> </w:t>
+      </w:r>
+      <w:proofErr w:type="spellStart"/>
+      <w:r>
+        <w:t>hai</w:t>
+      </w:r>
+      <w:proofErr w:type="spellEnd"/>
+      <w:r>
+        <w:t xml:space="preserve">. Agar ek </w:t>
+      </w:r>
+      <w:proofErr w:type="spellStart"/>
+      <w:r>
+        <w:t>bhi</w:t>
+      </w:r>
+      <w:proofErr w:type="spellEnd"/>
+      <w:r>
+        <w:t xml:space="preserve"> </w:t>
+      </w:r>
+      <w:proofErr w:type="spellStart"/>
+      <w:r>
+        <w:t>cheez</w:t>
+      </w:r>
+      <w:proofErr w:type="spellEnd"/>
+      <w:r>
+        <w:t xml:space="preserve"> miss hui, </w:t>
+      </w:r>
+      <w:proofErr w:type="spellStart"/>
+      <w:r>
+        <w:t>toh</w:t>
+      </w:r>
+      <w:proofErr w:type="spellEnd"/>
+      <w:r>
+        <w:t xml:space="preserve"> compiler error de </w:t>
+      </w:r>
+      <w:proofErr w:type="spellStart"/>
+      <w:r>
+        <w:t>dega</w:t>
+      </w:r>
+      <w:proofErr w:type="spellEnd"/>
+      <w:r>
+        <w:t>.</w:t>
+      </w:r>
+      <w:r>
+        <w:pict w14:anchorId="3E40E8A8">
+          <v:rect id="_x0000_i1035" style="width:0;height:1.5pt" o:hralign="center" o:hrstd="t" o:hr="t" fillcolor="#a0a0a0" stroked="f"/>
+        </w:pict>
+      </w:r>
+    </w:p>
+    <w:p>
+      <w:pPr>
+        <w:rPr>
+          <w:b/>
+          <w:bCs/>
+        </w:rPr>
+      </w:pPr>
+      <w:r>
+        <w:rPr>
+          <w:b/>
+          <w:bCs/>
+        </w:rPr>
+        <w:t>1. The Skeleton of C++ (Basic Code)</w:t>
+      </w:r>
+    </w:p>
+    <w:p>
+      <w:r>
+        <w:drawing>
+          <wp:inline distT="0" distB="0" distL="0" distR="0" wp14:anchorId="21E8F3B2" wp14:editId="00D9B202">
+            <wp:extent cx="5572903" cy="1724266"/>
+            <wp:effectExtent l="0" t="0" r="0" b="9525"/>
+            <wp:docPr id="841325511" name="Picture 1"/>
+            <wp:cNvGraphicFramePr>
+              <a:graphicFrameLocks xmlns:a="http://schemas.openxmlformats.org/drawingml/2006/main" noChangeAspect="1"/>
+            </wp:cNvGraphicFramePr>
+            <a:graphic xmlns:a="http://schemas.openxmlformats.org/drawingml/2006/main">
+              <a:graphicData uri="http://schemas.openxmlformats.org/drawingml/2006/picture">
+                <pic:pic xmlns:pic="http://schemas.openxmlformats.org/drawingml/2006/picture">
+                  <pic:nvPicPr>
+                    <pic:cNvPr id="841325511" name=""/>
+                    <pic:cNvPicPr/>
+                  </pic:nvPicPr>
+                  <pic:blipFill>
+                    <a:blip r:embed="rId8"/>
+                    <a:stretch>
+                      <a:fillRect/>
+                    </a:stretch>
+                  </pic:blipFill>
+                  <pic:spPr>
+                    <a:xfrm>
+                      <a:off x="0" y="0"/>
+                      <a:ext cx="5572903" cy="1724266"/>
+                    </a:xfrm>
+                    <a:prstGeom prst="rect">
+                      <a:avLst/>
+                    </a:prstGeom>
+                  </pic:spPr>
+                </pic:pic>
+              </a:graphicData>
+            </a:graphic>
+          </wp:inline>
+        </w:drawing>
+      </w:r>
+      <w:r>
+        <w:pict w14:anchorId="27CEEC2F">
+          <v:rect id="_x0000_i1033" style="width:0;height:1.5pt" o:hralign="center" o:hrstd="t" o:hr="t" fillcolor="#a0a0a0" stroked="f"/>
+        </w:pict>
+      </w:r>
+    </w:p>
+    <w:p>
+      <w:pPr>
+        <w:rPr>
+          <w:b/>
+          <w:bCs/>
+          <w:sz w:val="32"/>
+          <w:szCs w:val="32"/>
+          <w:u w:val="single"/>
+        </w:rPr>
+      </w:pPr>
+    </w:p>
+    <w:p>
+      <w:pPr>
+        <w:rPr>
+          <w:b/>
+          <w:bCs/>
+          <w:sz w:val="32"/>
+          <w:szCs w:val="32"/>
+          <w:u w:val="single"/>
+        </w:rPr>
+      </w:pPr>
+    </w:p>
+    <w:p>
+      <w:pPr>
+        <w:rPr>
+          <w:b/>
+          <w:bCs/>
+          <w:sz w:val="32"/>
+          <w:szCs w:val="32"/>
+          <w:u w:val="single"/>
+        </w:rPr>
+      </w:pPr>
+    </w:p>
+    <w:p>
+      <w:pPr>
+        <w:rPr>
+          <w:b/>
+          <w:bCs/>
+          <w:sz w:val="32"/>
+          <w:szCs w:val="32"/>
+          <w:u w:val="single"/>
+        </w:rPr>
+      </w:pPr>
+    </w:p>
+    <w:p>
+      <w:pPr>
+        <w:rPr>
+          <w:b/>
+          <w:bCs/>
+          <w:sz w:val="32"/>
+          <w:szCs w:val="32"/>
+          <w:u w:val="single"/>
+        </w:rPr>
+      </w:pPr>
+      <w:r>
+        <w:rPr>
+          <w:b/>
+          <w:bCs/>
+          <w:sz w:val="32"/>
+          <w:szCs w:val="32"/>
+          <w:u w:val="single"/>
+        </w:rPr>
+        <w:lastRenderedPageBreak/>
+        <w:t>IMPORTANT ABOUT COUT</w:t>
+      </w:r>
+    </w:p>
+    <w:p>
+      <w:pPr>
+        <w:rPr>
+          <w:b/>
+          <w:bCs/>
+        </w:rPr>
+      </w:pPr>
+      <w:r>
+        <w:rPr>
+          <w:b/>
+          <w:bCs/>
+        </w:rPr>
+        <w:drawing>
+          <wp:inline distT="0" distB="0" distL="0" distR="0" wp14:anchorId="4E6F2464" wp14:editId="28012A45">
+            <wp:extent cx="5731510" cy="5863590"/>
+            <wp:effectExtent l="0" t="0" r="2540" b="3810"/>
+            <wp:docPr id="982314223" name="Picture 1"/>
+            <wp:cNvGraphicFramePr>
+              <a:graphicFrameLocks xmlns:a="http://schemas.openxmlformats.org/drawingml/2006/main" noChangeAspect="1"/>
+            </wp:cNvGraphicFramePr>
+            <a:graphic xmlns:a="http://schemas.openxmlformats.org/drawingml/2006/main">
+              <a:graphicData uri="http://schemas.openxmlformats.org/drawingml/2006/picture">
+                <pic:pic xmlns:pic="http://schemas.openxmlformats.org/drawingml/2006/picture">
+                  <pic:nvPicPr>
+                    <pic:cNvPr id="982314223" name=""/>
+                    <pic:cNvPicPr/>
+                  </pic:nvPicPr>
+                  <pic:blipFill>
+                    <a:blip r:embed="rId9"/>
+                    <a:stretch>
+                      <a:fillRect/>
+                    </a:stretch>
+                  </pic:blipFill>
+                  <pic:spPr>
+                    <a:xfrm>
+                      <a:off x="0" y="0"/>
+                      <a:ext cx="5731510" cy="5863590"/>
+                    </a:xfrm>
+                    <a:prstGeom prst="rect">
+                      <a:avLst/>
+                    </a:prstGeom>
+                  </pic:spPr>
+                </pic:pic>
+              </a:graphicData>
+            </a:graphic>
+          </wp:inline>
+        </w:drawing>
+      </w:r>
+      <w:r>
+        <w:pict w14:anchorId="5E2DA9CD">
+          <v:rect id="_x0000_i1038" style="width:0;height:1.5pt" o:hralign="center" o:hrstd="t" o:hr="t" fillcolor="#a0a0a0" stroked="f"/>
+        </w:pict>
+      </w:r>
+    </w:p>
+    <w:p>
+      <w:pPr>
+        <w:rPr>
+          <w:b/>
+          <w:bCs/>
+        </w:rPr>
+      </w:pPr>
+      <w:r>
+        <w:rPr>
+          <w:b/>
+          <w:bCs/>
+        </w:rPr>
+        <w:t>2. Preprocessor Directive (#include)</w:t>
+      </w:r>
+    </w:p>
+    <w:p>
+      <w:pPr>
+        <w:numPr>
+          <w:ilvl w:val="0"/>
+          <w:numId w:val="8"/>
+        </w:numPr>
+      </w:pPr>
+      <w:r>
+        <w:rPr>
+          <w:b/>
+          <w:bCs/>
+        </w:rPr>
+        <w:t xml:space="preserve">Kya </w:t>
+      </w:r>
+      <w:proofErr w:type="spellStart"/>
+      <w:r>
+        <w:rPr>
+          <w:b/>
+          <w:bCs/>
+        </w:rPr>
+        <w:t>hai</w:t>
+      </w:r>
+      <w:proofErr w:type="spellEnd"/>
+      <w:r>
+        <w:rPr>
+          <w:b/>
+          <w:bCs/>
+        </w:rPr>
+        <w:t>?</w:t>
+      </w:r>
+      <w:r>
+        <w:t xml:space="preserve"> #include &lt;iostream&gt; program ki </w:t>
+      </w:r>
+      <w:proofErr w:type="spellStart"/>
+      <w:r>
+        <w:t>pehli</w:t>
+      </w:r>
+      <w:proofErr w:type="spellEnd"/>
+      <w:r>
+        <w:t xml:space="preserve"> line </w:t>
+      </w:r>
+      <w:proofErr w:type="spellStart"/>
+      <w:r>
+        <w:t>hoti</w:t>
+      </w:r>
+      <w:proofErr w:type="spellEnd"/>
+      <w:r>
+        <w:t xml:space="preserve"> </w:t>
+      </w:r>
+      <w:proofErr w:type="spellStart"/>
+      <w:r>
+        <w:t>hai</w:t>
+      </w:r>
+      <w:proofErr w:type="spellEnd"/>
+      <w:r>
+        <w:t>.</w:t>
+      </w:r>
+    </w:p>
+    <w:p>
+      <w:pPr>
+        <w:numPr>
+          <w:ilvl w:val="0"/>
+          <w:numId w:val="8"/>
+        </w:numPr>
+      </w:pPr>
+      <w:r>
+        <w:rPr>
+          <w:b/>
+          <w:bCs/>
+        </w:rPr>
+        <w:t>Code Detail:</w:t>
+      </w:r>
+      <w:r>
+        <w:t xml:space="preserve"> # ka </w:t>
+      </w:r>
+      <w:proofErr w:type="spellStart"/>
+      <w:r>
+        <w:t>matlab</w:t>
+      </w:r>
+      <w:proofErr w:type="spellEnd"/>
+      <w:r>
+        <w:t xml:space="preserve"> </w:t>
+      </w:r>
+      <w:proofErr w:type="spellStart"/>
+      <w:r>
+        <w:t>hai</w:t>
+      </w:r>
+      <w:proofErr w:type="spellEnd"/>
+      <w:r>
+        <w:t xml:space="preserve"> preprocessor (jo compilation se </w:t>
+      </w:r>
+      <w:proofErr w:type="spellStart"/>
+      <w:r>
+        <w:t>pehle</w:t>
+      </w:r>
+      <w:proofErr w:type="spellEnd"/>
+      <w:r>
+        <w:t xml:space="preserve"> run </w:t>
+      </w:r>
+      <w:proofErr w:type="spellStart"/>
+      <w:r>
+        <w:t>hota</w:t>
+      </w:r>
+      <w:proofErr w:type="spellEnd"/>
+      <w:r>
+        <w:t xml:space="preserve"> </w:t>
+      </w:r>
+      <w:proofErr w:type="spellStart"/>
+      <w:r>
+        <w:t>hai</w:t>
+      </w:r>
+      <w:proofErr w:type="spellEnd"/>
+      <w:r>
+        <w:t xml:space="preserve">). iostream ka </w:t>
+      </w:r>
+      <w:proofErr w:type="spellStart"/>
+      <w:r>
+        <w:t>matlab</w:t>
+      </w:r>
+      <w:proofErr w:type="spellEnd"/>
+      <w:r>
+        <w:t xml:space="preserve"> </w:t>
+      </w:r>
+      <w:proofErr w:type="spellStart"/>
+      <w:r>
+        <w:t>hai</w:t>
+      </w:r>
+      <w:proofErr w:type="spellEnd"/>
+      <w:r>
+        <w:t xml:space="preserve"> </w:t>
+      </w:r>
+      <w:r>
+        <w:rPr>
+          <w:b/>
+          <w:bCs/>
+        </w:rPr>
+        <w:t>Input-Output Stream</w:t>
+      </w:r>
+      <w:r>
+        <w:t>.</w:t>
+      </w:r>
+    </w:p>
+    <w:p>
+      <w:pPr>
+        <w:numPr>
+          <w:ilvl w:val="0"/>
+          <w:numId w:val="8"/>
+        </w:numPr>
+      </w:pPr>
+      <w:r>
+        <w:rPr>
+          <w:b/>
+          <w:bCs/>
+        </w:rPr>
+        <w:t xml:space="preserve">Kyun </w:t>
+      </w:r>
+      <w:proofErr w:type="spellStart"/>
+      <w:r>
+        <w:rPr>
+          <w:b/>
+          <w:bCs/>
+        </w:rPr>
+        <w:t>chahiye</w:t>
+      </w:r>
+      <w:proofErr w:type="spellEnd"/>
+      <w:r>
+        <w:rPr>
+          <w:b/>
+          <w:bCs/>
+        </w:rPr>
+        <w:t>?</w:t>
+      </w:r>
+      <w:r>
+        <w:t xml:space="preserve"> Agar </w:t>
+      </w:r>
+      <w:proofErr w:type="spellStart"/>
+      <w:r>
+        <w:t>tumhe</w:t>
+      </w:r>
+      <w:proofErr w:type="spellEnd"/>
+      <w:r>
+        <w:t xml:space="preserve"> screen par </w:t>
+      </w:r>
+      <w:proofErr w:type="spellStart"/>
+      <w:r>
+        <w:t>kuch</w:t>
+      </w:r>
+      <w:proofErr w:type="spellEnd"/>
+      <w:r>
+        <w:t xml:space="preserve"> print </w:t>
+      </w:r>
+      <w:proofErr w:type="spellStart"/>
+      <w:r>
+        <w:t>karna</w:t>
+      </w:r>
+      <w:proofErr w:type="spellEnd"/>
+      <w:r>
+        <w:t xml:space="preserve"> </w:t>
+      </w:r>
+      <w:proofErr w:type="spellStart"/>
+      <w:r>
+        <w:t>hai</w:t>
+      </w:r>
+      <w:proofErr w:type="spellEnd"/>
+      <w:r>
+        <w:t xml:space="preserve"> (</w:t>
+      </w:r>
+      <w:proofErr w:type="spellStart"/>
+      <w:r>
+        <w:t>cout</w:t>
+      </w:r>
+      <w:proofErr w:type="spellEnd"/>
+      <w:r>
+        <w:t xml:space="preserve">) </w:t>
+      </w:r>
+      <w:proofErr w:type="spellStart"/>
+      <w:r>
+        <w:t>ya</w:t>
+      </w:r>
+      <w:proofErr w:type="spellEnd"/>
+      <w:r>
+        <w:t xml:space="preserve"> user se </w:t>
+      </w:r>
+      <w:proofErr w:type="spellStart"/>
+      <w:r>
+        <w:t>kuch</w:t>
+      </w:r>
+      <w:proofErr w:type="spellEnd"/>
+      <w:r>
+        <w:t xml:space="preserve"> </w:t>
+      </w:r>
+      <w:proofErr w:type="spellStart"/>
+      <w:r>
+        <w:t>poochna</w:t>
+      </w:r>
+      <w:proofErr w:type="spellEnd"/>
+      <w:r>
+        <w:t xml:space="preserve"> </w:t>
+      </w:r>
+      <w:proofErr w:type="spellStart"/>
+      <w:r>
+        <w:t>hai</w:t>
+      </w:r>
+      <w:proofErr w:type="spellEnd"/>
+      <w:r>
+        <w:t xml:space="preserve"> (</w:t>
+      </w:r>
+      <w:proofErr w:type="spellStart"/>
+      <w:r>
+        <w:t>cin</w:t>
+      </w:r>
+      <w:proofErr w:type="spellEnd"/>
+      <w:r>
+        <w:t xml:space="preserve">), </w:t>
+      </w:r>
+      <w:proofErr w:type="spellStart"/>
+      <w:r>
+        <w:t>toh</w:t>
+      </w:r>
+      <w:proofErr w:type="spellEnd"/>
+      <w:r>
+        <w:t xml:space="preserve"> ye library compulsory </w:t>
+      </w:r>
+      <w:proofErr w:type="spellStart"/>
+      <w:r>
+        <w:t>hai</w:t>
+      </w:r>
+      <w:proofErr w:type="spellEnd"/>
+      <w:r>
+        <w:t>.</w:t>
+      </w:r>
+    </w:p>
+    <w:p>
+      <w:pPr>
+        <w:rPr>
+          <w:b/>
+          <w:bCs/>
+        </w:rPr>
+      </w:pPr>
+      <w:r>
+        <w:lastRenderedPageBreak/>
+        <w:drawing>
+          <wp:inline distT="0" distB="0" distL="0" distR="0" wp14:anchorId="551EAC9F" wp14:editId="14D123A1">
+            <wp:extent cx="5572903" cy="3715268"/>
+            <wp:effectExtent l="0" t="0" r="8890" b="0"/>
+            <wp:docPr id="1509233961" name="Picture 1"/>
+            <wp:cNvGraphicFramePr>
+              <a:graphicFrameLocks xmlns:a="http://schemas.openxmlformats.org/drawingml/2006/main" noChangeAspect="1"/>
+            </wp:cNvGraphicFramePr>
+            <a:graphic xmlns:a="http://schemas.openxmlformats.org/drawingml/2006/main">
+              <a:graphicData uri="http://schemas.openxmlformats.org/drawingml/2006/picture">
+                <pic:pic xmlns:pic="http://schemas.openxmlformats.org/drawingml/2006/picture">
+                  <pic:nvPicPr>
+                    <pic:cNvPr id="1509233961" name=""/>
+                    <pic:cNvPicPr/>
+                  </pic:nvPicPr>
+                  <pic:blipFill>
+                    <a:blip r:embed="rId10"/>
+                    <a:stretch>
+                      <a:fillRect/>
+                    </a:stretch>
+                  </pic:blipFill>
+                  <pic:spPr>
+                    <a:xfrm>
+                      <a:off x="0" y="0"/>
+                      <a:ext cx="5572903" cy="3715268"/>
+                    </a:xfrm>
+                    <a:prstGeom prst="rect">
+                      <a:avLst/>
+                    </a:prstGeom>
+                  </pic:spPr>
+                </pic:pic>
+              </a:graphicData>
+            </a:graphic>
+          </wp:inline>
+        </w:drawing>
+      </w:r>
+      <w:r>
+        <w:pict w14:anchorId="19E70162">
+          <v:rect id="_x0000_i1037" style="width:0;height:1.5pt" o:hralign="center" o:hrstd="t" o:hr="t" fillcolor="#a0a0a0" stroked="f"/>
+        </w:pict>
+      </w:r>
+    </w:p>
+    <w:p>
+      <w:pPr>
+        <w:rPr>
+          <w:b/>
+          <w:bCs/>
+        </w:rPr>
+      </w:pPr>
+      <w:r>
+        <w:rPr>
+          <w:b/>
+          <w:bCs/>
+        </w:rPr>
+        <w:t>3. Namespace Standard (The 'std' Story)</w:t>
+      </w:r>
+    </w:p>
+    <w:p>
+      <w:r>
+        <w:t xml:space="preserve">Video </w:t>
+      </w:r>
+      <w:proofErr w:type="spellStart"/>
+      <w:r>
+        <w:t>mein</w:t>
+      </w:r>
+      <w:proofErr w:type="spellEnd"/>
+      <w:r>
+        <w:t xml:space="preserve"> </w:t>
+      </w:r>
+      <w:proofErr w:type="spellStart"/>
+      <w:r>
+        <w:t>bataya</w:t>
+      </w:r>
+      <w:proofErr w:type="spellEnd"/>
+      <w:r>
+        <w:t xml:space="preserve"> </w:t>
+      </w:r>
+      <w:proofErr w:type="spellStart"/>
+      <w:r>
+        <w:t>gaya</w:t>
+      </w:r>
+      <w:proofErr w:type="spellEnd"/>
+      <w:r>
+        <w:t xml:space="preserve"> </w:t>
+      </w:r>
+      <w:proofErr w:type="spellStart"/>
+      <w:r>
+        <w:t>hai</w:t>
+      </w:r>
+      <w:proofErr w:type="spellEnd"/>
+      <w:r>
+        <w:t xml:space="preserve"> ki </w:t>
+      </w:r>
+      <w:proofErr w:type="spellStart"/>
+      <w:r>
+        <w:t>cout</w:t>
+      </w:r>
+      <w:proofErr w:type="spellEnd"/>
+      <w:r>
+        <w:t xml:space="preserve"> akela </w:t>
+      </w:r>
+      <w:proofErr w:type="spellStart"/>
+      <w:r>
+        <w:t>kaam</w:t>
+      </w:r>
+      <w:proofErr w:type="spellEnd"/>
+      <w:r>
+        <w:t xml:space="preserve"> </w:t>
+      </w:r>
+      <w:proofErr w:type="spellStart"/>
+      <w:r>
+        <w:t>nahi</w:t>
+      </w:r>
+      <w:proofErr w:type="spellEnd"/>
+      <w:r>
+        <w:t xml:space="preserve"> </w:t>
+      </w:r>
+      <w:proofErr w:type="spellStart"/>
+      <w:r>
+        <w:t>karta</w:t>
+      </w:r>
+      <w:proofErr w:type="spellEnd"/>
+      <w:r>
+        <w:t xml:space="preserve">, wo std (standard) namespace </w:t>
+      </w:r>
+      <w:proofErr w:type="spellStart"/>
+      <w:r>
+        <w:t>ke</w:t>
+      </w:r>
+      <w:proofErr w:type="spellEnd"/>
+      <w:r>
+        <w:t xml:space="preserve"> </w:t>
+      </w:r>
+      <w:proofErr w:type="spellStart"/>
+      <w:r>
+        <w:t>andar</w:t>
+      </w:r>
+      <w:proofErr w:type="spellEnd"/>
+      <w:r>
+        <w:t xml:space="preserve"> </w:t>
+      </w:r>
+      <w:proofErr w:type="spellStart"/>
+      <w:r>
+        <w:t>hota</w:t>
+      </w:r>
+      <w:proofErr w:type="spellEnd"/>
+      <w:r>
+        <w:t xml:space="preserve"> </w:t>
+      </w:r>
+      <w:proofErr w:type="spellStart"/>
+      <w:r>
+        <w:t>hai</w:t>
+      </w:r>
+      <w:proofErr w:type="spellEnd"/>
+      <w:r>
+        <w:t xml:space="preserve">. Iske do </w:t>
+      </w:r>
+      <w:proofErr w:type="spellStart"/>
+      <w:r>
+        <w:t>tarike</w:t>
+      </w:r>
+      <w:proofErr w:type="spellEnd"/>
+      <w:r>
+        <w:t xml:space="preserve"> hain:</w:t>
+      </w:r>
+    </w:p>
+    <w:p>
+      <w:pPr>
+        <w:numPr>
+          <w:ilvl w:val="0"/>
+          <w:numId w:val="9"/>
+        </w:numPr>
+      </w:pPr>
+      <w:r>
+        <w:rPr>
+          <w:b/>
+          <w:bCs/>
+        </w:rPr>
+        <w:t>Tarika 1 (Scope Resolution):</w:t>
+      </w:r>
+      <w:r>
+        <w:t xml:space="preserve"> Har </w:t>
+      </w:r>
+      <w:proofErr w:type="spellStart"/>
+      <w:r>
+        <w:t>baar</w:t>
+      </w:r>
+      <w:proofErr w:type="spellEnd"/>
+      <w:r>
+        <w:t xml:space="preserve"> </w:t>
+      </w:r>
+      <w:proofErr w:type="gramStart"/>
+      <w:r>
+        <w:t>std::</w:t>
+      </w:r>
+      <w:proofErr w:type="spellStart"/>
+      <w:proofErr w:type="gramEnd"/>
+      <w:r>
+        <w:t>cout</w:t>
+      </w:r>
+      <w:proofErr w:type="spellEnd"/>
+      <w:r>
+        <w:t xml:space="preserve"> </w:t>
+      </w:r>
+      <w:proofErr w:type="spellStart"/>
+      <w:r>
+        <w:t>likho</w:t>
+      </w:r>
+      <w:proofErr w:type="spellEnd"/>
+      <w:r>
+        <w:t>.</w:t>
+      </w:r>
+    </w:p>
+    <w:p>
+      <w:pPr>
+        <w:numPr>
+          <w:ilvl w:val="0"/>
+          <w:numId w:val="9"/>
+        </w:numPr>
+      </w:pPr>
+      <w:r>
+        <w:rPr>
+          <w:b/>
+          <w:bCs/>
+        </w:rPr>
+        <w:t>Tarika 2 (The Shortcut):</w:t>
+      </w:r>
+      <w:r>
+        <w:t xml:space="preserve"> Program </w:t>
+      </w:r>
+      <w:proofErr w:type="spellStart"/>
+      <w:r>
+        <w:t>ke</w:t>
+      </w:r>
+      <w:proofErr w:type="spellEnd"/>
+      <w:r>
+        <w:t xml:space="preserve"> </w:t>
+      </w:r>
+      <w:proofErr w:type="spellStart"/>
+      <w:r>
+        <w:t>upar</w:t>
+      </w:r>
+      <w:proofErr w:type="spellEnd"/>
+      <w:r>
+        <w:t xml:space="preserve"> using namespace std; </w:t>
+      </w:r>
+      <w:proofErr w:type="spellStart"/>
+      <w:r>
+        <w:t>likh</w:t>
+      </w:r>
+      <w:proofErr w:type="spellEnd"/>
+      <w:r>
+        <w:t xml:space="preserve"> do.</w:t>
+      </w:r>
+    </w:p>
+    <w:p>
+      <w:pPr>
+        <w:ind w:left="360"/>
+        <w:rPr>
+          <w:b/>
+          <w:bCs/>
+          <w:u w:val="single"/>
+        </w:rPr>
+      </w:pPr>
+      <w:r>
+        <w:rPr>
+          <w:b/>
+          <w:bCs/>
+          <w:u w:val="single"/>
+        </w:rPr>
+        <w:t>WAYS OF USING NAMESPACE ITEMS</w:t>
+      </w:r>
+    </w:p>
+    <w:p>
+      <w:pPr>
+        <w:ind w:left="360"/>
+      </w:pPr>
+      <w:r>
+        <w:drawing>
+          <wp:inline distT="0" distB="0" distL="0" distR="0" wp14:anchorId="5AD54E74" wp14:editId="442FAF20">
+            <wp:extent cx="4058216" cy="2010056"/>
+            <wp:effectExtent l="0" t="0" r="0" b="9525"/>
+            <wp:docPr id="720230909" name="Picture 1"/>
+            <wp:cNvGraphicFramePr>
+              <a:graphicFrameLocks xmlns:a="http://schemas.openxmlformats.org/drawingml/2006/main" noChangeAspect="1"/>
+            </wp:cNvGraphicFramePr>
+            <a:graphic xmlns:a="http://schemas.openxmlformats.org/drawingml/2006/main">
+              <a:graphicData uri="http://schemas.openxmlformats.org/drawingml/2006/picture">
+                <pic:pic xmlns:pic="http://schemas.openxmlformats.org/drawingml/2006/picture">
+                  <pic:nvPicPr>
+                    <pic:cNvPr id="720230909" name=""/>
+                    <pic:cNvPicPr/>
+                  </pic:nvPicPr>
+                  <pic:blipFill>
+                    <a:blip r:embed="rId11"/>
+                    <a:stretch>
+                      <a:fillRect/>
+                    </a:stretch>
+                  </pic:blipFill>
+                  <pic:spPr>
+                    <a:xfrm>
+                      <a:off x="0" y="0"/>
+                      <a:ext cx="4058216" cy="2010056"/>
+                    </a:xfrm>
+                    <a:prstGeom prst="rect">
+                      <a:avLst/>
+                    </a:prstGeom>
+                  </pic:spPr>
+                </pic:pic>
+              </a:graphicData>
+            </a:graphic>
+          </wp:inline>
+        </w:drawing>
+      </w:r>
+    </w:p>
+    <w:p>
+      <w:r>
+        <w:lastRenderedPageBreak/>
+        <w:drawing>
+          <wp:inline distT="0" distB="0" distL="0" distR="0" wp14:anchorId="4888117C" wp14:editId="2713AA93">
+            <wp:extent cx="4572638" cy="905001"/>
+            <wp:effectExtent l="0" t="0" r="0" b="9525"/>
+            <wp:docPr id="937654196" name="Picture 1"/>
+            <wp:cNvGraphicFramePr>
+              <a:graphicFrameLocks xmlns:a="http://schemas.openxmlformats.org/drawingml/2006/main" noChangeAspect="1"/>
+            </wp:cNvGraphicFramePr>
+            <a:graphic xmlns:a="http://schemas.openxmlformats.org/drawingml/2006/main">
+              <a:graphicData uri="http://schemas.openxmlformats.org/drawingml/2006/picture">
+                <pic:pic xmlns:pic="http://schemas.openxmlformats.org/drawingml/2006/picture">
+                  <pic:nvPicPr>
+                    <pic:cNvPr id="937654196" name=""/>
+                    <pic:cNvPicPr/>
+                  </pic:nvPicPr>
+                  <pic:blipFill>
+                    <a:blip r:embed="rId12"/>
+                    <a:stretch>
+                      <a:fillRect/>
+                    </a:stretch>
+                  </pic:blipFill>
+                  <pic:spPr>
+                    <a:xfrm>
+                      <a:off x="0" y="0"/>
+                      <a:ext cx="4572638" cy="905001"/>
+                    </a:xfrm>
+                    <a:prstGeom prst="rect">
+                      <a:avLst/>
+                    </a:prstGeom>
+                  </pic:spPr>
+                </pic:pic>
+              </a:graphicData>
+            </a:graphic>
+          </wp:inline>
+        </w:drawing>
+      </w:r>
+    </w:p>
+    <w:p>
+      <w:pPr>
+        <w:rPr>
+          <w:b/>
+          <w:bCs/>
+          <w:u w:val="single"/>
+        </w:rPr>
+      </w:pPr>
+      <w:r>
+        <w:rPr>
+          <w:b/>
+          <w:bCs/>
+          <w:u w:val="single"/>
+        </w:rPr>
+        <w:t>WE CAN CREATE A NAMESPACE OURSELVES TOO!!</w:t>
+      </w:r>
+    </w:p>
+    <w:p>
+      <w:r>
+        <w:drawing>
+          <wp:inline distT="0" distB="0" distL="0" distR="0" wp14:anchorId="74A366EB" wp14:editId="3BB02BF3">
+            <wp:extent cx="3524742" cy="3153215"/>
+            <wp:effectExtent l="0" t="0" r="0" b="9525"/>
+            <wp:docPr id="595717310" name="Picture 1"/>
+            <wp:cNvGraphicFramePr>
+              <a:graphicFrameLocks xmlns:a="http://schemas.openxmlformats.org/drawingml/2006/main" noChangeAspect="1"/>
+            </wp:cNvGraphicFramePr>
+            <a:graphic xmlns:a="http://schemas.openxmlformats.org/drawingml/2006/main">
+              <a:graphicData uri="http://schemas.openxmlformats.org/drawingml/2006/picture">
+                <pic:pic xmlns:pic="http://schemas.openxmlformats.org/drawingml/2006/picture">
+                  <pic:nvPicPr>
+                    <pic:cNvPr id="595717310" name=""/>
+                    <pic:cNvPicPr/>
+                  </pic:nvPicPr>
+                  <pic:blipFill>
+                    <a:blip r:embed="rId13"/>
+                    <a:stretch>
+                      <a:fillRect/>
+                    </a:stretch>
+                  </pic:blipFill>
+                  <pic:spPr>
+                    <a:xfrm>
+                      <a:off x="0" y="0"/>
+                      <a:ext cx="3524742" cy="3153215"/>
+                    </a:xfrm>
+                    <a:prstGeom prst="rect">
+                      <a:avLst/>
+                    </a:prstGeom>
+                  </pic:spPr>
+                </pic:pic>
+              </a:graphicData>
+            </a:graphic>
+          </wp:inline>
+        </w:drawing>
+      </w:r>
+    </w:p>
+    <w:p>
+      <w:pPr>
+        <w:rPr>
+          <w:b/>
+          <w:bCs/>
+          <w:sz w:val="28"/>
+          <w:szCs w:val="28"/>
+        </w:rPr>
+      </w:pPr>
+      <w:r>
+        <w:rPr>
+          <w:b/>
+          <w:bCs/>
+          <w:sz w:val="28"/>
+          <w:szCs w:val="28"/>
+        </w:rPr>
+        <w:t>SOMETIMES IT IS BETTER TO NOT ALWAYS USE NAMESPACE FULLY BECAUSE IT CAN BE PRETTY HEAVY!!</w:t>
+      </w:r>
+      <w:r>
+        <w:pict w14:anchorId="5A464F6F">
+          <v:rect id="_x0000_i1039" style="width:0;height:1.5pt" o:hralign="center" o:hrstd="t" o:hr="t" fillcolor="#a0a0a0" stroked="f"/>
+        </w:pict>
+      </w:r>
+    </w:p>
+    <w:p>
+      <w:pPr>
+        <w:rPr>
+          <w:b/>
+          <w:bCs/>
+          <w:sz w:val="22"/>
+          <w:szCs w:val="22"/>
+        </w:rPr>
+      </w:pPr>
+      <w:r>
+        <w:rPr>
+          <w:b/>
+          <w:bCs/>
+          <w:sz w:val="22"/>
+          <w:szCs w:val="22"/>
+        </w:rPr>
+        <w:t>4. Main Function: Program ka Entry Point</w:t>
+      </w:r>
+    </w:p>
+    <w:p>
+      <w:pPr>
+        <w:numPr>
+          <w:ilvl w:val="0"/>
+          <w:numId w:val="10"/>
+        </w:numPr>
+        <w:rPr>
+          <w:sz w:val="22"/>
+          <w:szCs w:val="22"/>
+        </w:rPr>
+      </w:pPr>
+      <w:r>
+        <w:rPr>
+          <w:b/>
+          <w:bCs/>
+          <w:sz w:val="22"/>
+          <w:szCs w:val="22"/>
+        </w:rPr>
+        <w:t xml:space="preserve">int </w:t>
+      </w:r>
+      <w:proofErr w:type="gramStart"/>
+      <w:r>
+        <w:rPr>
+          <w:b/>
+          <w:bCs/>
+          <w:sz w:val="22"/>
+          <w:szCs w:val="22"/>
+        </w:rPr>
+        <w:t>main(</w:t>
+      </w:r>
+      <w:proofErr w:type="gramEnd"/>
+      <w:r>
+        <w:rPr>
+          <w:b/>
+          <w:bCs/>
+          <w:sz w:val="22"/>
+          <w:szCs w:val="22"/>
+        </w:rPr>
+        <w:t>)</w:t>
+      </w:r>
+      <w:r>
+        <w:rPr>
+          <w:sz w:val="22"/>
+          <w:szCs w:val="22"/>
+        </w:rPr>
+        <w:t xml:space="preserve">: Ye wo </w:t>
+      </w:r>
+      <w:proofErr w:type="spellStart"/>
+      <w:r>
+        <w:rPr>
+          <w:sz w:val="22"/>
+          <w:szCs w:val="22"/>
+        </w:rPr>
+        <w:t>jagah</w:t>
+      </w:r>
+      <w:proofErr w:type="spellEnd"/>
+      <w:r>
+        <w:rPr>
+          <w:sz w:val="22"/>
+          <w:szCs w:val="22"/>
+        </w:rPr>
+        <w:t xml:space="preserve"> </w:t>
+      </w:r>
+      <w:proofErr w:type="spellStart"/>
+      <w:r>
+        <w:rPr>
+          <w:sz w:val="22"/>
+          <w:szCs w:val="22"/>
+        </w:rPr>
+        <w:t>hai</w:t>
+      </w:r>
+      <w:proofErr w:type="spellEnd"/>
+      <w:r>
+        <w:rPr>
+          <w:sz w:val="22"/>
+          <w:szCs w:val="22"/>
+        </w:rPr>
+        <w:t xml:space="preserve"> </w:t>
+      </w:r>
+      <w:proofErr w:type="spellStart"/>
+      <w:r>
+        <w:rPr>
+          <w:sz w:val="22"/>
+          <w:szCs w:val="22"/>
+        </w:rPr>
+        <w:t>jahan</w:t>
+      </w:r>
+      <w:proofErr w:type="spellEnd"/>
+      <w:r>
+        <w:rPr>
+          <w:sz w:val="22"/>
+          <w:szCs w:val="22"/>
+        </w:rPr>
+        <w:t xml:space="preserve"> se </w:t>
+      </w:r>
+      <w:proofErr w:type="spellStart"/>
+      <w:r>
+        <w:rPr>
+          <w:sz w:val="22"/>
+          <w:szCs w:val="22"/>
+        </w:rPr>
+        <w:t>tumhara</w:t>
+      </w:r>
+      <w:proofErr w:type="spellEnd"/>
+      <w:r>
+        <w:rPr>
+          <w:sz w:val="22"/>
+          <w:szCs w:val="22"/>
+        </w:rPr>
+        <w:t xml:space="preserve"> program execution </w:t>
+      </w:r>
+      <w:proofErr w:type="spellStart"/>
+      <w:r>
+        <w:rPr>
+          <w:sz w:val="22"/>
+          <w:szCs w:val="22"/>
+        </w:rPr>
+        <w:t>shuru</w:t>
+      </w:r>
+      <w:proofErr w:type="spellEnd"/>
+      <w:r>
+        <w:rPr>
+          <w:sz w:val="22"/>
+          <w:szCs w:val="22"/>
+        </w:rPr>
+        <w:t xml:space="preserve"> </w:t>
+      </w:r>
+      <w:proofErr w:type="spellStart"/>
+      <w:r>
+        <w:rPr>
+          <w:sz w:val="22"/>
+          <w:szCs w:val="22"/>
+        </w:rPr>
+        <w:t>karta</w:t>
+      </w:r>
+      <w:proofErr w:type="spellEnd"/>
+      <w:r>
+        <w:rPr>
+          <w:sz w:val="22"/>
+          <w:szCs w:val="22"/>
+        </w:rPr>
+        <w:t xml:space="preserve"> </w:t>
+      </w:r>
+      <w:proofErr w:type="spellStart"/>
+      <w:r>
+        <w:rPr>
+          <w:sz w:val="22"/>
+          <w:szCs w:val="22"/>
+        </w:rPr>
+        <w:t>hai</w:t>
+      </w:r>
+      <w:proofErr w:type="spellEnd"/>
+      <w:r>
+        <w:rPr>
+          <w:sz w:val="22"/>
+          <w:szCs w:val="22"/>
+        </w:rPr>
+        <w:t>.</w:t>
+      </w:r>
+    </w:p>
+    <w:p>
+      <w:pPr>
+        <w:numPr>
+          <w:ilvl w:val="0"/>
+          <w:numId w:val="10"/>
+        </w:numPr>
+        <w:rPr>
+          <w:sz w:val="22"/>
+          <w:szCs w:val="22"/>
+        </w:rPr>
+      </w:pPr>
+      <w:proofErr w:type="gramStart"/>
+      <w:r>
+        <w:rPr>
+          <w:b/>
+          <w:bCs/>
+          <w:sz w:val="22"/>
+          <w:szCs w:val="22"/>
+        </w:rPr>
+        <w:t>{ }</w:t>
+      </w:r>
+      <w:proofErr w:type="gramEnd"/>
+      <w:r>
+        <w:rPr>
+          <w:b/>
+          <w:bCs/>
+          <w:sz w:val="22"/>
+          <w:szCs w:val="22"/>
+        </w:rPr>
+        <w:t xml:space="preserve"> (Curly Braces)</w:t>
+      </w:r>
+      <w:r>
+        <w:rPr>
+          <w:sz w:val="22"/>
+          <w:szCs w:val="22"/>
+        </w:rPr>
+        <w:t xml:space="preserve">: Inke beech ka area main function ki "body" </w:t>
+      </w:r>
+      <w:proofErr w:type="spellStart"/>
+      <w:r>
+        <w:rPr>
+          <w:sz w:val="22"/>
+          <w:szCs w:val="22"/>
+        </w:rPr>
+        <w:t>ya</w:t>
+      </w:r>
+      <w:proofErr w:type="spellEnd"/>
+      <w:r>
+        <w:rPr>
+          <w:sz w:val="22"/>
+          <w:szCs w:val="22"/>
+        </w:rPr>
+        <w:t xml:space="preserve"> "scope" </w:t>
+      </w:r>
+      <w:proofErr w:type="spellStart"/>
+      <w:r>
+        <w:rPr>
+          <w:sz w:val="22"/>
+          <w:szCs w:val="22"/>
+        </w:rPr>
+        <w:t>kehlata</w:t>
+      </w:r>
+      <w:proofErr w:type="spellEnd"/>
+      <w:r>
+        <w:rPr>
+          <w:sz w:val="22"/>
+          <w:szCs w:val="22"/>
+        </w:rPr>
+        <w:t xml:space="preserve"> </w:t>
+      </w:r>
+      <w:proofErr w:type="spellStart"/>
+      <w:r>
+        <w:rPr>
+          <w:sz w:val="22"/>
+          <w:szCs w:val="22"/>
+        </w:rPr>
+        <w:t>hai</w:t>
+      </w:r>
+      <w:proofErr w:type="spellEnd"/>
+      <w:r>
+        <w:rPr>
+          <w:sz w:val="22"/>
+          <w:szCs w:val="22"/>
+        </w:rPr>
+        <w:t>.</w:t>
+      </w:r>
+    </w:p>
+    <w:p>
+      <w:pPr>
+        <w:numPr>
+          <w:ilvl w:val="0"/>
+          <w:numId w:val="10"/>
+        </w:numPr>
+        <w:rPr>
+          <w:sz w:val="22"/>
+          <w:szCs w:val="22"/>
+        </w:rPr>
+      </w:pPr>
+      <w:r>
+        <w:rPr>
+          <w:b/>
+          <w:bCs/>
+          <w:sz w:val="22"/>
+          <w:szCs w:val="22"/>
+        </w:rPr>
+        <w:t xml:space="preserve">return </w:t>
+      </w:r>
+      <w:proofErr w:type="gramStart"/>
+      <w:r>
+        <w:rPr>
+          <w:b/>
+          <w:bCs/>
+          <w:sz w:val="22"/>
+          <w:szCs w:val="22"/>
+        </w:rPr>
+        <w:t>0;</w:t>
+      </w:r>
+      <w:r>
+        <w:rPr>
+          <w:sz w:val="22"/>
+          <w:szCs w:val="22"/>
+        </w:rPr>
+        <w:t>:</w:t>
+      </w:r>
+      <w:proofErr w:type="gramEnd"/>
+      <w:r>
+        <w:rPr>
+          <w:sz w:val="22"/>
+          <w:szCs w:val="22"/>
+        </w:rPr>
+        <w:t xml:space="preserve"> Ye compiler ko batata </w:t>
+      </w:r>
+      <w:proofErr w:type="spellStart"/>
+      <w:r>
+        <w:rPr>
+          <w:sz w:val="22"/>
+          <w:szCs w:val="22"/>
+        </w:rPr>
+        <w:t>hai</w:t>
+      </w:r>
+      <w:proofErr w:type="spellEnd"/>
+      <w:r>
+        <w:rPr>
+          <w:sz w:val="22"/>
+          <w:szCs w:val="22"/>
+        </w:rPr>
+        <w:t xml:space="preserve"> ki program successfully finish </w:t>
+      </w:r>
+      <w:proofErr w:type="spellStart"/>
+      <w:r>
+        <w:rPr>
+          <w:sz w:val="22"/>
+          <w:szCs w:val="22"/>
+        </w:rPr>
+        <w:t>ho</w:t>
+      </w:r>
+      <w:proofErr w:type="spellEnd"/>
+      <w:r>
+        <w:rPr>
+          <w:sz w:val="22"/>
+          <w:szCs w:val="22"/>
+        </w:rPr>
+        <w:t xml:space="preserve"> </w:t>
+      </w:r>
+      <w:proofErr w:type="spellStart"/>
+      <w:r>
+        <w:rPr>
+          <w:sz w:val="22"/>
+          <w:szCs w:val="22"/>
+        </w:rPr>
+        <w:t>gaya</w:t>
+      </w:r>
+      <w:proofErr w:type="spellEnd"/>
+      <w:r>
+        <w:rPr>
+          <w:sz w:val="22"/>
+          <w:szCs w:val="22"/>
+        </w:rPr>
+        <w:t xml:space="preserve">. Game dev </w:t>
+      </w:r>
+      <w:proofErr w:type="spellStart"/>
+      <w:r>
+        <w:rPr>
+          <w:sz w:val="22"/>
+          <w:szCs w:val="22"/>
+        </w:rPr>
+        <w:t>mein</w:t>
+      </w:r>
+      <w:proofErr w:type="spellEnd"/>
+      <w:r>
+        <w:rPr>
+          <w:sz w:val="22"/>
+          <w:szCs w:val="22"/>
+        </w:rPr>
+        <w:t xml:space="preserve"> agar return 0 </w:t>
+      </w:r>
+      <w:proofErr w:type="spellStart"/>
+      <w:r>
+        <w:rPr>
+          <w:sz w:val="22"/>
+          <w:szCs w:val="22"/>
+        </w:rPr>
+        <w:t>nahi</w:t>
+      </w:r>
+      <w:proofErr w:type="spellEnd"/>
+      <w:r>
+        <w:rPr>
+          <w:sz w:val="22"/>
+          <w:szCs w:val="22"/>
+        </w:rPr>
+        <w:t xml:space="preserve"> </w:t>
+      </w:r>
+      <w:proofErr w:type="spellStart"/>
+      <w:r>
+        <w:rPr>
+          <w:sz w:val="22"/>
+          <w:szCs w:val="22"/>
+        </w:rPr>
+        <w:t>hota</w:t>
+      </w:r>
+      <w:proofErr w:type="spellEnd"/>
+      <w:r>
+        <w:rPr>
+          <w:sz w:val="22"/>
+          <w:szCs w:val="22"/>
+        </w:rPr>
+        <w:t xml:space="preserve">, </w:t>
+      </w:r>
+      <w:proofErr w:type="spellStart"/>
+      <w:r>
+        <w:rPr>
+          <w:sz w:val="22"/>
+          <w:szCs w:val="22"/>
+        </w:rPr>
+        <w:t>toh</w:t>
+      </w:r>
+      <w:proofErr w:type="spellEnd"/>
+      <w:r>
+        <w:rPr>
+          <w:sz w:val="22"/>
+          <w:szCs w:val="22"/>
+        </w:rPr>
+        <w:t xml:space="preserve"> </w:t>
+      </w:r>
+      <w:proofErr w:type="spellStart"/>
+      <w:r>
+        <w:rPr>
+          <w:sz w:val="22"/>
+          <w:szCs w:val="22"/>
+        </w:rPr>
+        <w:t>kabhi</w:t>
+      </w:r>
+      <w:proofErr w:type="spellEnd"/>
+      <w:r>
+        <w:rPr>
+          <w:sz w:val="22"/>
+          <w:szCs w:val="22"/>
+        </w:rPr>
+        <w:t xml:space="preserve"> </w:t>
+      </w:r>
+      <w:proofErr w:type="spellStart"/>
+      <w:r>
+        <w:rPr>
+          <w:sz w:val="22"/>
+          <w:szCs w:val="22"/>
+        </w:rPr>
+        <w:t>kabhi</w:t>
+      </w:r>
+      <w:proofErr w:type="spellEnd"/>
+      <w:r>
+        <w:rPr>
+          <w:sz w:val="22"/>
+          <w:szCs w:val="22"/>
+        </w:rPr>
+        <w:t xml:space="preserve"> system ko </w:t>
+      </w:r>
+      <w:proofErr w:type="spellStart"/>
+      <w:r>
+        <w:rPr>
+          <w:sz w:val="22"/>
+          <w:szCs w:val="22"/>
+        </w:rPr>
+        <w:t>lagta</w:t>
+      </w:r>
+      <w:proofErr w:type="spellEnd"/>
+      <w:r>
+        <w:rPr>
+          <w:sz w:val="22"/>
+          <w:szCs w:val="22"/>
+        </w:rPr>
+        <w:t xml:space="preserve"> </w:t>
+      </w:r>
+      <w:proofErr w:type="spellStart"/>
+      <w:r>
+        <w:rPr>
+          <w:sz w:val="22"/>
+          <w:szCs w:val="22"/>
+        </w:rPr>
+        <w:t>hai</w:t>
+      </w:r>
+      <w:proofErr w:type="spellEnd"/>
+      <w:r>
+        <w:rPr>
+          <w:sz w:val="22"/>
+          <w:szCs w:val="22"/>
+        </w:rPr>
+        <w:t xml:space="preserve"> game crash </w:t>
+      </w:r>
+      <w:proofErr w:type="spellStart"/>
+      <w:r>
+        <w:rPr>
+          <w:sz w:val="22"/>
+          <w:szCs w:val="22"/>
+        </w:rPr>
+        <w:t>ho</w:t>
+      </w:r>
+      <w:proofErr w:type="spellEnd"/>
+      <w:r>
+        <w:rPr>
+          <w:sz w:val="22"/>
+          <w:szCs w:val="22"/>
+        </w:rPr>
+        <w:t xml:space="preserve"> </w:t>
+      </w:r>
+      <w:proofErr w:type="spellStart"/>
+      <w:r>
+        <w:rPr>
+          <w:sz w:val="22"/>
+          <w:szCs w:val="22"/>
+        </w:rPr>
+        <w:t>gaya</w:t>
+      </w:r>
+      <w:proofErr w:type="spellEnd"/>
+      <w:r>
+        <w:rPr>
+          <w:sz w:val="22"/>
+          <w:szCs w:val="22"/>
+        </w:rPr>
+        <w:t>.</w:t>
+      </w:r>
+    </w:p>
+    <w:p>
+      <w:pPr>
+        <w:rPr>
+          <w:b/>
+          <w:bCs/>
+          <w:sz w:val="22"/>
+          <w:szCs w:val="22"/>
+        </w:rPr>
+      </w:pPr>
+      <w:r>
+        <w:rPr>
+          <w:b/>
+          <w:bCs/>
+          <w:sz w:val="22"/>
+          <w:szCs w:val="22"/>
+        </w:rPr>
+        <w:t>5. Output &amp; Operators (</w:t>
+      </w:r>
+      <w:proofErr w:type="spellStart"/>
+      <w:r>
+        <w:rPr>
+          <w:b/>
+          <w:bCs/>
+          <w:sz w:val="22"/>
+          <w:szCs w:val="22"/>
+        </w:rPr>
+        <w:t>cout</w:t>
+      </w:r>
+      <w:proofErr w:type="spellEnd"/>
+      <w:r>
+        <w:rPr>
+          <w:b/>
+          <w:bCs/>
+          <w:sz w:val="22"/>
+          <w:szCs w:val="22"/>
+        </w:rPr>
+        <w:t xml:space="preserve"> and &lt;&lt;)</w:t>
+      </w:r>
+    </w:p>
+    <w:p>
+      <w:pPr>
+        <w:numPr>
+          <w:ilvl w:val="0"/>
+          <w:numId w:val="11"/>
+        </w:numPr>
+        <w:rPr>
+          <w:sz w:val="22"/>
+          <w:szCs w:val="22"/>
+        </w:rPr>
+      </w:pPr>
+      <w:proofErr w:type="spellStart"/>
+      <w:r>
+        <w:rPr>
+          <w:b/>
+          <w:bCs/>
+          <w:sz w:val="22"/>
+          <w:szCs w:val="22"/>
+        </w:rPr>
+        <w:t>cout</w:t>
+      </w:r>
+      <w:proofErr w:type="spellEnd"/>
+      <w:r>
+        <w:rPr>
+          <w:sz w:val="22"/>
+          <w:szCs w:val="22"/>
+        </w:rPr>
+        <w:t xml:space="preserve">: Iska full form </w:t>
+      </w:r>
+      <w:proofErr w:type="spellStart"/>
+      <w:r>
+        <w:rPr>
+          <w:sz w:val="22"/>
+          <w:szCs w:val="22"/>
+        </w:rPr>
+        <w:t>hai</w:t>
+      </w:r>
+      <w:proofErr w:type="spellEnd"/>
+      <w:r>
+        <w:rPr>
+          <w:sz w:val="22"/>
+          <w:szCs w:val="22"/>
+        </w:rPr>
+        <w:t xml:space="preserve"> </w:t>
+      </w:r>
+      <w:r>
+        <w:rPr>
+          <w:b/>
+          <w:bCs/>
+          <w:sz w:val="22"/>
+          <w:szCs w:val="22"/>
+        </w:rPr>
+        <w:t>Character Output</w:t>
+      </w:r>
+      <w:r>
+        <w:rPr>
+          <w:sz w:val="22"/>
+          <w:szCs w:val="22"/>
+        </w:rPr>
+        <w:t>.</w:t>
+      </w:r>
+    </w:p>
+    <w:p>
+      <w:pPr>
+        <w:numPr>
+          <w:ilvl w:val="0"/>
+          <w:numId w:val="11"/>
+        </w:numPr>
+        <w:rPr>
+          <w:sz w:val="22"/>
+          <w:szCs w:val="22"/>
+        </w:rPr>
+      </w:pPr>
+      <w:r>
+        <w:rPr>
+          <w:b/>
+          <w:bCs/>
+          <w:sz w:val="22"/>
+          <w:szCs w:val="22"/>
+        </w:rPr>
+        <w:t>Insertion Operator (&lt;&lt;)</w:t>
+      </w:r>
+      <w:r>
+        <w:rPr>
+          <w:sz w:val="22"/>
+          <w:szCs w:val="22"/>
+        </w:rPr>
+        <w:t xml:space="preserve">: In do arrows ka </w:t>
+      </w:r>
+      <w:proofErr w:type="spellStart"/>
+      <w:r>
+        <w:rPr>
+          <w:sz w:val="22"/>
+          <w:szCs w:val="22"/>
+        </w:rPr>
+        <w:t>muh</w:t>
+      </w:r>
+      <w:proofErr w:type="spellEnd"/>
+      <w:r>
+        <w:rPr>
+          <w:sz w:val="22"/>
+          <w:szCs w:val="22"/>
+        </w:rPr>
+        <w:t xml:space="preserve"> </w:t>
+      </w:r>
+      <w:proofErr w:type="spellStart"/>
+      <w:r>
+        <w:rPr>
+          <w:sz w:val="22"/>
+          <w:szCs w:val="22"/>
+        </w:rPr>
+        <w:t>hamesha</w:t>
+      </w:r>
+      <w:proofErr w:type="spellEnd"/>
+      <w:r>
+        <w:rPr>
+          <w:sz w:val="22"/>
+          <w:szCs w:val="22"/>
+        </w:rPr>
+        <w:t xml:space="preserve"> </w:t>
+      </w:r>
+      <w:proofErr w:type="spellStart"/>
+      <w:r>
+        <w:rPr>
+          <w:sz w:val="22"/>
+          <w:szCs w:val="22"/>
+        </w:rPr>
+        <w:t>cout</w:t>
+      </w:r>
+      <w:proofErr w:type="spellEnd"/>
+      <w:r>
+        <w:rPr>
+          <w:sz w:val="22"/>
+          <w:szCs w:val="22"/>
+        </w:rPr>
+        <w:t xml:space="preserve"> ki </w:t>
+      </w:r>
+      <w:proofErr w:type="spellStart"/>
+      <w:r>
+        <w:rPr>
+          <w:sz w:val="22"/>
+          <w:szCs w:val="22"/>
+        </w:rPr>
+        <w:t>taraf</w:t>
+      </w:r>
+      <w:proofErr w:type="spellEnd"/>
+      <w:r>
+        <w:rPr>
+          <w:sz w:val="22"/>
+          <w:szCs w:val="22"/>
+        </w:rPr>
+        <w:t xml:space="preserve"> </w:t>
+      </w:r>
+      <w:proofErr w:type="spellStart"/>
+      <w:r>
+        <w:rPr>
+          <w:sz w:val="22"/>
+          <w:szCs w:val="22"/>
+        </w:rPr>
+        <w:t>hota</w:t>
+      </w:r>
+      <w:proofErr w:type="spellEnd"/>
+      <w:r>
+        <w:rPr>
+          <w:sz w:val="22"/>
+          <w:szCs w:val="22"/>
+        </w:rPr>
+        <w:t xml:space="preserve"> </w:t>
+      </w:r>
+      <w:proofErr w:type="spellStart"/>
+      <w:r>
+        <w:rPr>
+          <w:sz w:val="22"/>
+          <w:szCs w:val="22"/>
+        </w:rPr>
+        <w:t>hai</w:t>
+      </w:r>
+      <w:proofErr w:type="spellEnd"/>
+      <w:r>
+        <w:rPr>
+          <w:sz w:val="22"/>
+          <w:szCs w:val="22"/>
+        </w:rPr>
+        <w:t xml:space="preserve">, </w:t>
+      </w:r>
+      <w:proofErr w:type="spellStart"/>
+      <w:r>
+        <w:rPr>
+          <w:sz w:val="22"/>
+          <w:szCs w:val="22"/>
+        </w:rPr>
+        <w:t>kyunki</w:t>
+      </w:r>
+      <w:proofErr w:type="spellEnd"/>
+      <w:r>
+        <w:rPr>
+          <w:sz w:val="22"/>
+          <w:szCs w:val="22"/>
+        </w:rPr>
+        <w:t xml:space="preserve"> hum data ko output stream </w:t>
+      </w:r>
+      <w:proofErr w:type="spellStart"/>
+      <w:r>
+        <w:rPr>
+          <w:sz w:val="22"/>
+          <w:szCs w:val="22"/>
+        </w:rPr>
+        <w:t>mein</w:t>
+      </w:r>
+      <w:proofErr w:type="spellEnd"/>
+      <w:r>
+        <w:rPr>
+          <w:sz w:val="22"/>
+          <w:szCs w:val="22"/>
+        </w:rPr>
+        <w:t xml:space="preserve"> "insert" </w:t>
+      </w:r>
+      <w:proofErr w:type="spellStart"/>
+      <w:r>
+        <w:rPr>
+          <w:sz w:val="22"/>
+          <w:szCs w:val="22"/>
+        </w:rPr>
+        <w:t>kar</w:t>
+      </w:r>
+      <w:proofErr w:type="spellEnd"/>
+      <w:r>
+        <w:rPr>
+          <w:sz w:val="22"/>
+          <w:szCs w:val="22"/>
+        </w:rPr>
+        <w:t xml:space="preserve"> </w:t>
+      </w:r>
+      <w:proofErr w:type="spellStart"/>
+      <w:r>
+        <w:rPr>
+          <w:sz w:val="22"/>
+          <w:szCs w:val="22"/>
+        </w:rPr>
+        <w:t>rahe</w:t>
+      </w:r>
+      <w:proofErr w:type="spellEnd"/>
+      <w:r>
+        <w:rPr>
+          <w:sz w:val="22"/>
+          <w:szCs w:val="22"/>
+        </w:rPr>
+        <w:t xml:space="preserve"> hain.</w:t>
+      </w:r>
+    </w:p>
+    <w:p>
+      <w:pPr>
+        <w:numPr>
+          <w:ilvl w:val="0"/>
+          <w:numId w:val="11"/>
+        </w:numPr>
+        <w:rPr>
+          <w:sz w:val="22"/>
+          <w:szCs w:val="22"/>
+        </w:rPr>
+      </w:pPr>
+      <w:r>
+        <w:rPr>
+          <w:b/>
+          <w:bCs/>
+          <w:sz w:val="22"/>
+          <w:szCs w:val="22"/>
+        </w:rPr>
+        <w:t xml:space="preserve">Semicolon </w:t>
+      </w:r>
+      <w:proofErr w:type="gramStart"/>
+      <w:r>
+        <w:rPr>
+          <w:b/>
+          <w:bCs/>
+          <w:sz w:val="22"/>
+          <w:szCs w:val="22"/>
+        </w:rPr>
+        <w:t>( ;</w:t>
+      </w:r>
+      <w:proofErr w:type="gramEnd"/>
+      <w:r>
+        <w:rPr>
+          <w:b/>
+          <w:bCs/>
+          <w:sz w:val="22"/>
+          <w:szCs w:val="22"/>
+        </w:rPr>
+        <w:t xml:space="preserve"> )</w:t>
+      </w:r>
+      <w:r>
+        <w:rPr>
+          <w:sz w:val="22"/>
+          <w:szCs w:val="22"/>
+        </w:rPr>
+        <w:t xml:space="preserve">: C++ </w:t>
+      </w:r>
+      <w:proofErr w:type="spellStart"/>
+      <w:r>
+        <w:rPr>
+          <w:sz w:val="22"/>
+          <w:szCs w:val="22"/>
+        </w:rPr>
+        <w:t>mein</w:t>
+      </w:r>
+      <w:proofErr w:type="spellEnd"/>
+      <w:r>
+        <w:rPr>
+          <w:sz w:val="22"/>
+          <w:szCs w:val="22"/>
+        </w:rPr>
+        <w:t xml:space="preserve"> </w:t>
+      </w:r>
+      <w:proofErr w:type="spellStart"/>
+      <w:r>
+        <w:rPr>
+          <w:sz w:val="22"/>
+          <w:szCs w:val="22"/>
+        </w:rPr>
+        <w:t>har</w:t>
+      </w:r>
+      <w:proofErr w:type="spellEnd"/>
+      <w:r>
+        <w:rPr>
+          <w:sz w:val="22"/>
+          <w:szCs w:val="22"/>
+        </w:rPr>
+        <w:t xml:space="preserve"> line </w:t>
+      </w:r>
+      <w:proofErr w:type="spellStart"/>
+      <w:r>
+        <w:rPr>
+          <w:sz w:val="22"/>
+          <w:szCs w:val="22"/>
+        </w:rPr>
+        <w:t>ke</w:t>
+      </w:r>
+      <w:proofErr w:type="spellEnd"/>
+      <w:r>
+        <w:rPr>
+          <w:sz w:val="22"/>
+          <w:szCs w:val="22"/>
+        </w:rPr>
+        <w:t xml:space="preserve"> </w:t>
+      </w:r>
+      <w:proofErr w:type="spellStart"/>
+      <w:proofErr w:type="gramStart"/>
+      <w:r>
+        <w:rPr>
+          <w:sz w:val="22"/>
+          <w:szCs w:val="22"/>
+        </w:rPr>
+        <w:t>baad</w:t>
+      </w:r>
+      <w:proofErr w:type="spellEnd"/>
+      <w:r>
+        <w:rPr>
+          <w:sz w:val="22"/>
+          <w:szCs w:val="22"/>
+        </w:rPr>
+        <w:t xml:space="preserve"> ;</w:t>
+      </w:r>
+      <w:proofErr w:type="gramEnd"/>
+      <w:r>
+        <w:rPr>
+          <w:sz w:val="22"/>
+          <w:szCs w:val="22"/>
+        </w:rPr>
+        <w:t xml:space="preserve"> </w:t>
+      </w:r>
+      <w:proofErr w:type="spellStart"/>
+      <w:r>
+        <w:rPr>
+          <w:sz w:val="22"/>
+          <w:szCs w:val="22"/>
+        </w:rPr>
+        <w:t>lagana</w:t>
+      </w:r>
+      <w:proofErr w:type="spellEnd"/>
+      <w:r>
+        <w:rPr>
+          <w:sz w:val="22"/>
+          <w:szCs w:val="22"/>
+        </w:rPr>
+        <w:t xml:space="preserve"> mandatory </w:t>
+      </w:r>
+      <w:proofErr w:type="spellStart"/>
+      <w:r>
+        <w:rPr>
+          <w:sz w:val="22"/>
+          <w:szCs w:val="22"/>
+        </w:rPr>
+        <w:t>hai</w:t>
+      </w:r>
+      <w:proofErr w:type="spellEnd"/>
+      <w:r>
+        <w:rPr>
+          <w:sz w:val="22"/>
+          <w:szCs w:val="22"/>
+        </w:rPr>
+        <w:t xml:space="preserve">. Ye line ka "full stop" </w:t>
+      </w:r>
+      <w:proofErr w:type="spellStart"/>
+      <w:r>
+        <w:rPr>
+          <w:sz w:val="22"/>
+          <w:szCs w:val="22"/>
+        </w:rPr>
+        <w:t>hai</w:t>
+      </w:r>
+      <w:proofErr w:type="spellEnd"/>
+      <w:r>
+        <w:rPr>
+          <w:sz w:val="22"/>
+          <w:szCs w:val="22"/>
+        </w:rPr>
+        <w:t>.</w:t>
+      </w:r>
+    </w:p>
+    <w:p>
+      <w:pPr>
+        <w:rPr>
+          <w:sz w:val="22"/>
+          <w:szCs w:val="22"/>
+        </w:rPr>
+      </w:pPr>
+      <w:r>
+        <w:rPr>
+          <w:sz w:val="22"/>
+          <w:szCs w:val="22"/>
+        </w:rPr>
+        <w:pict w14:anchorId="7DAD5DE6">
+          <v:rect id="_x0000_i1047" style="width:0;height:1.5pt" o:hralign="center" o:hrstd="t" o:hr="t" fillcolor="#a0a0a0" stroked="f"/>
+        </w:pict>
+      </w:r>
+    </w:p>
+    <w:p>
+      <w:pPr>
+        <w:rPr>
+          <w:b/>
+          <w:bCs/>
+          <w:sz w:val="22"/>
+          <w:szCs w:val="22"/>
+        </w:rPr>
+      </w:pPr>
+    </w:p>
+    <w:p>
+      <w:pPr>
+        <w:rPr>
+          <w:b/>
+          <w:bCs/>
+          <w:sz w:val="28"/>
+          <w:szCs w:val="28"/>
+          <w:u w:val="single"/>
+        </w:rPr>
+      </w:pPr>
+      <w:r>
+        <w:rPr>
+          <w:b/>
+          <w:bCs/>
+          <w:sz w:val="28"/>
+          <w:szCs w:val="28"/>
+          <w:u w:val="single"/>
+        </w:rPr>
+        <w:lastRenderedPageBreak/>
+        <w:t>WHOLE SUMMARY</w:t>
+      </w:r>
+    </w:p>
+    <w:p>
+      <w:pPr>
+        <w:rPr>
+          <w:sz w:val="22"/>
+          <w:szCs w:val="22"/>
+        </w:rPr>
+      </w:pPr>
+      <w:r>
+        <w:rPr>
+          <w:sz w:val="22"/>
+          <w:szCs w:val="22"/>
+        </w:rPr>
+        <w:drawing>
+          <wp:inline distT="0" distB="0" distL="0" distR="0" wp14:anchorId="34585809" wp14:editId="1905ACC6">
+            <wp:extent cx="5731510" cy="2799080"/>
+            <wp:effectExtent l="0" t="0" r="2540" b="1270"/>
+            <wp:docPr id="1164536220" name="Picture 1"/>
+            <wp:cNvGraphicFramePr>
+              <a:graphicFrameLocks xmlns:a="http://schemas.openxmlformats.org/drawingml/2006/main" noChangeAspect="1"/>
+            </wp:cNvGraphicFramePr>
+            <a:graphic xmlns:a="http://schemas.openxmlformats.org/drawingml/2006/main">
+              <a:graphicData uri="http://schemas.openxmlformats.org/drawingml/2006/picture">
+                <pic:pic xmlns:pic="http://schemas.openxmlformats.org/drawingml/2006/picture">
+                  <pic:nvPicPr>
+                    <pic:cNvPr id="1164536220" name=""/>
+                    <pic:cNvPicPr/>
+                  </pic:nvPicPr>
+                  <pic:blipFill>
+                    <a:blip r:embed="rId14"/>
+                    <a:stretch>
+                      <a:fillRect/>
+                    </a:stretch>
+                  </pic:blipFill>
+                  <pic:spPr>
+                    <a:xfrm>
+                      <a:off x="0" y="0"/>
+                      <a:ext cx="5731510" cy="2799080"/>
+                    </a:xfrm>
+                    <a:prstGeom prst="rect">
+                      <a:avLst/>
+                    </a:prstGeom>
+                  </pic:spPr>
+                </pic:pic>
+              </a:graphicData>
+            </a:graphic>
+          </wp:inline>
+        </w:drawing>
+      </w:r>
+      <w:r>
+        <w:rPr>
+          <w:sz w:val="22"/>
+          <w:szCs w:val="22"/>
+        </w:rPr>
+        <w:pict w14:anchorId="4DC6C55D">
+          <v:rect id="_x0000_i1049" style="width:0;height:1.5pt" o:hralign="center" o:hrstd="t" o:hr="t" fillcolor="#a0a0a0" stroked="f"/>
+        </w:pict>
+      </w:r>
+    </w:p>
+    <w:p>
+      <w:pPr>
+        <w:rPr>
+          <w:b/>
+          <w:bCs/>
+          <w:u w:val="single"/>
+        </w:rPr>
+      </w:pPr>
+      <w:proofErr w:type="gramStart"/>
+      <w:r>
+        <w:rPr>
+          <w:b/>
+          <w:bCs/>
+          <w:u w:val="single"/>
+        </w:rPr>
+        <w:t>IMPORTANT( LIBRARY</w:t>
+      </w:r>
+      <w:proofErr w:type="gramEnd"/>
+      <w:r>
+        <w:rPr>
+          <w:b/>
+          <w:bCs/>
+          <w:u w:val="single"/>
+        </w:rPr>
+        <w:t xml:space="preserve">, FILES, </w:t>
+      </w:r>
+      <w:proofErr w:type="gramStart"/>
+      <w:r>
+        <w:rPr>
+          <w:b/>
+          <w:bCs/>
+          <w:u w:val="single"/>
+        </w:rPr>
+        <w:t>MODULES..</w:t>
+      </w:r>
+      <w:proofErr w:type="gramEnd"/>
+      <w:r>
+        <w:rPr>
+          <w:b/>
+          <w:bCs/>
+          <w:u w:val="single"/>
+        </w:rPr>
+        <w:t>PYTHON AND C++)</w:t>
+      </w:r>
+    </w:p>
+    <w:p>
+      <w:pPr>
+        <w:rPr>
+          <w:sz w:val="22"/>
+          <w:szCs w:val="22"/>
+        </w:rPr>
+      </w:pPr>
+      <w:r>
+        <w:rPr>
+          <w:sz w:val="22"/>
+          <w:szCs w:val="22"/>
+        </w:rPr>
+        <w:drawing>
+          <wp:inline distT="0" distB="0" distL="0" distR="0" wp14:anchorId="27F1F644" wp14:editId="33FFB56A">
+            <wp:extent cx="5731510" cy="5034915"/>
+            <wp:effectExtent l="0" t="0" r="2540" b="0"/>
+            <wp:docPr id="384140706" name="Picture 1"/>
+            <wp:cNvGraphicFramePr>
+              <a:graphicFrameLocks xmlns:a="http://schemas.openxmlformats.org/drawingml/2006/main" noChangeAspect="1"/>
+            </wp:cNvGraphicFramePr>
+            <a:graphic xmlns:a="http://schemas.openxmlformats.org/drawingml/2006/main">
+              <a:graphicData uri="http://schemas.openxmlformats.org/drawingml/2006/picture">
+                <pic:pic xmlns:pic="http://schemas.openxmlformats.org/drawingml/2006/picture">
+                  <pic:nvPicPr>
+                    <pic:cNvPr id="384140706" name=""/>
+                    <pic:cNvPicPr/>
+                  </pic:nvPicPr>
+                  <pic:blipFill>
+                    <a:blip r:embed="rId15"/>
+                    <a:stretch>
+                      <a:fillRect/>
+                    </a:stretch>
+                  </pic:blipFill>
+                  <pic:spPr>
+                    <a:xfrm>
+                      <a:off x="0" y="0"/>
+                      <a:ext cx="5731510" cy="5034915"/>
+                    </a:xfrm>
+                    <a:prstGeom prst="rect">
+                      <a:avLst/>
+                    </a:prstGeom>
+                  </pic:spPr>
+                </pic:pic>
+              </a:graphicData>
+            </a:graphic>
+          </wp:inline>
+        </w:drawing>
+      </w:r>
+    </w:p>
+    <w:p>
+      <w:pPr>
+        <w:rPr>
+          <w:sz w:val="22"/>
+          <w:szCs w:val="22"/>
+        </w:rPr>
+      </w:pPr>
+      <w:r>
+        <w:rPr>
+          <w:sz w:val="22"/>
+          <w:szCs w:val="22"/>
+        </w:rPr>
+        <w:lastRenderedPageBreak/>
+        <w:drawing>
+          <wp:inline distT="0" distB="0" distL="0" distR="0" wp14:anchorId="09BE45F2" wp14:editId="638DFB80">
+            <wp:extent cx="5715798" cy="5944430"/>
+            <wp:effectExtent l="0" t="0" r="0" b="0"/>
+            <wp:docPr id="281756824" name="Picture 1"/>
+            <wp:cNvGraphicFramePr>
+              <a:graphicFrameLocks xmlns:a="http://schemas.openxmlformats.org/drawingml/2006/main" noChangeAspect="1"/>
+            </wp:cNvGraphicFramePr>
+            <a:graphic xmlns:a="http://schemas.openxmlformats.org/drawingml/2006/main">
+              <a:graphicData uri="http://schemas.openxmlformats.org/drawingml/2006/picture">
+                <pic:pic xmlns:pic="http://schemas.openxmlformats.org/drawingml/2006/picture">
+                  <pic:nvPicPr>
+                    <pic:cNvPr id="281756824" name=""/>
+                    <pic:cNvPicPr/>
+                  </pic:nvPicPr>
+                  <pic:blipFill>
+                    <a:blip r:embed="rId16"/>
+                    <a:stretch>
+                      <a:fillRect/>
+                    </a:stretch>
+                  </pic:blipFill>
+                  <pic:spPr>
+                    <a:xfrm>
+                      <a:off x="0" y="0"/>
+                      <a:ext cx="5715798" cy="5944430"/>
+                    </a:xfrm>
+                    <a:prstGeom prst="rect">
+                      <a:avLst/>
+                    </a:prstGeom>
+                  </pic:spPr>
+                </pic:pic>
+              </a:graphicData>
+            </a:graphic>
+          </wp:inline>
+        </w:drawing>
+      </w:r>
+    </w:p>
+    <w:p>
+      <w:pPr>
+        <w:rPr>
+          <w:sz w:val="22"/>
+          <w:szCs w:val="22"/>
+        </w:rPr>
+      </w:pPr>
+      <w:r>
+        <w:rPr>
+          <w:sz w:val="22"/>
+          <w:szCs w:val="22"/>
+        </w:rPr>
+        <w:drawing>
+          <wp:inline distT="0" distB="0" distL="0" distR="0" wp14:anchorId="55C5934F" wp14:editId="28262A3D">
+            <wp:extent cx="5712357" cy="2725270"/>
+            <wp:effectExtent l="0" t="0" r="3175" b="0"/>
+            <wp:docPr id="803469888" name="Picture 1"/>
+            <wp:cNvGraphicFramePr>
+              <a:graphicFrameLocks xmlns:a="http://schemas.openxmlformats.org/drawingml/2006/main" noChangeAspect="1"/>
+            </wp:cNvGraphicFramePr>
+            <a:graphic xmlns:a="http://schemas.openxmlformats.org/drawingml/2006/main">
+              <a:graphicData uri="http://schemas.openxmlformats.org/drawingml/2006/picture">
+                <pic:pic xmlns:pic="http://schemas.openxmlformats.org/drawingml/2006/picture">
+                  <pic:nvPicPr>
+                    <pic:cNvPr id="803469888" name=""/>
+                    <pic:cNvPicPr/>
+                  </pic:nvPicPr>
+                  <pic:blipFill>
+                    <a:blip r:embed="rId17"/>
+                    <a:stretch>
+                      <a:fillRect/>
+                    </a:stretch>
+                  </pic:blipFill>
+                  <pic:spPr>
+                    <a:xfrm>
+                      <a:off x="0" y="0"/>
+                      <a:ext cx="5831733" cy="2782222"/>
+                    </a:xfrm>
+                    <a:prstGeom prst="rect">
+                      <a:avLst/>
+                    </a:prstGeom>
+                  </pic:spPr>
+                </pic:pic>
+              </a:graphicData>
+            </a:graphic>
+          </wp:inline>
+        </w:drawing>
+      </w:r>
+    </w:p>
+    <w:p>
+      <w:pPr>
+        <w:rPr>
+          <w:sz w:val="22"/>
+          <w:szCs w:val="22"/>
+        </w:rPr>
+      </w:pPr>
+      <w:r>
+        <w:rPr>
+          <w:sz w:val="22"/>
+          <w:szCs w:val="22"/>
+        </w:rPr>
+        <w:lastRenderedPageBreak/>
+        <w:drawing>
+          <wp:inline distT="0" distB="0" distL="0" distR="0" wp14:anchorId="71692E52" wp14:editId="6B23047C">
+            <wp:extent cx="5553850" cy="1619476"/>
+            <wp:effectExtent l="0" t="0" r="8890" b="0"/>
+            <wp:docPr id="282822820" name="Picture 1"/>
+            <wp:cNvGraphicFramePr>
+              <a:graphicFrameLocks xmlns:a="http://schemas.openxmlformats.org/drawingml/2006/main" noChangeAspect="1"/>
+            </wp:cNvGraphicFramePr>
+            <a:graphic xmlns:a="http://schemas.openxmlformats.org/drawingml/2006/main">
+              <a:graphicData uri="http://schemas.openxmlformats.org/drawingml/2006/picture">
+                <pic:pic xmlns:pic="http://schemas.openxmlformats.org/drawingml/2006/picture">
+                  <pic:nvPicPr>
+                    <pic:cNvPr id="282822820" name=""/>
+                    <pic:cNvPicPr/>
+                  </pic:nvPicPr>
+                  <pic:blipFill>
+                    <a:blip r:embed="rId18"/>
+                    <a:stretch>
+                      <a:fillRect/>
+                    </a:stretch>
+                  </pic:blipFill>
+                  <pic:spPr>
+                    <a:xfrm>
+                      <a:off x="0" y="0"/>
+                      <a:ext cx="5553850" cy="1619476"/>
+                    </a:xfrm>
+                    <a:prstGeom prst="rect">
+                      <a:avLst/>
+                    </a:prstGeom>
+                  </pic:spPr>
+                </pic:pic>
+              </a:graphicData>
+            </a:graphic>
+          </wp:inline>
+        </w:drawing>
+      </w:r>
+      <w:r>
+        <w:rPr>
+          <w:sz w:val="22"/>
+          <w:szCs w:val="22"/>
+        </w:rPr>
+        <w:pict w14:anchorId="14445C1E">
+          <v:rect id="_x0000_i1050" style="width:0;height:1.5pt" o:hralign="center" o:hrstd="t" o:hr="t" fillcolor="#a0a0a0" stroked="f"/>
+        </w:pict>
+      </w:r>
+    </w:p>
+    <w:p>
+      <w:pPr>
+        <w:rPr>
+          <w:sz w:val="22"/>
+          <w:szCs w:val="22"/>
+        </w:rPr>
+      </w:pPr>
+    </w:p>
     <w:sectPr>
       <w:pgSz w:w="11906" w:h="16838"/>
       <w:pgMar w:top="1440" w:right="1440" w:bottom="1440" w:left="1440" w:header="708" w:footer="708" w:gutter="0"/>
@@ -2331,6 +5438,119 @@
 <file path=word/numbering.xml><?xml version="1.0" encoding="utf-8"?>
 <w:numbering xmlns:wpc="http://schemas.microsoft.com/office/word/2010/wordprocessingCanvas" xmlns:cx="http://schemas.microsoft.com/office/drawing/2014/chartex" xmlns:cx1="http://schemas.microsoft.com/office/drawing/2015/9/8/chartex" xmlns:cx2="http://schemas.microsoft.com/office/drawing/2015/10/21/chartex" xmlns:cx3="http://schemas.microsoft.com/office/drawing/2016/5/9/chartex" xmlns:cx4="http://schemas.microsoft.com/office/drawing/2016/5/10/chartex" xmlns:cx5="http://schemas.microsoft.com/office/drawing/2016/5/11/chartex" xmlns:cx6="http://schemas.microsoft.com/office/drawing/2016/5/12/chartex" xmlns:cx7="http://schemas.microsoft.com/office/drawing/2016/5/13/chartex" xmlns:cx8="http://schemas.microsoft.com/office/drawing/2016/5/14/chartex" xmlns:mc="http://schemas.openxmlformats.org/markup-compatibility/2006" xmlns:aink="http://schemas.microsoft.com/office/drawing/2016/ink" xmlns:am3d="http://schemas.microsoft.com/office/drawing/2017/model3d" xmlns:o="urn:schemas-microsoft-com:office:office" xmlns:oel="http://schemas.microsoft.com/office/2019/extlst" xmlns:r="http://schemas.openxmlformats.org/officeDocument/2006/relationships" xmlns:m="http://schemas.openxmlformats.org/officeDocument/2006/math" xmlns:v="urn:schemas-microsoft-com:vml" xmlns:wp14="http://schemas.microsoft.com/office/word/2010/wordprocessingDrawing" xmlns:wp="http://schemas.openxmlformats.org/drawingml/2006/wordprocessingDrawing" xmlns:w10="urn:schemas-microsoft-com:office:word" xmlns:w="http://schemas.openxmlformats.org/wordprocessingml/2006/main" xmlns:w14="http://schemas.microsoft.com/office/word/2010/wordml" xmlns:w15="http://schemas.microsoft.com/office/word/2012/wordml" xmlns:w16cex="http://schemas.microsoft.com/office/word/2018/wordml/cex" xmlns:w16cid="http://schemas.microsoft.com/office/word/2016/wordml/cid" xmlns:w16="http://schemas.microsoft.com/office/word/2018/wordml" xmlns:w16du="http://schemas.microsoft.com/office/word/2023/wordml/word16du" xmlns:w16sdtdh="http://schemas.microsoft.com/office/word/2020/wordml/sdtdatahash" xmlns:w16sdtfl="http://schemas.microsoft.com/office/word/2024/wordml/sdtformatlock" xmlns:w16se="http://schemas.microsoft.com/office/word/2015/wordml/symex" xmlns:wpg="http://schemas.microsoft.com/office/word/2010/wordprocessingGroup" xmlns:wpi="http://schemas.microsoft.com/office/word/2010/wordprocessingInk" xmlns:wne="http://schemas.microsoft.com/office/word/2006/wordml" xmlns:wps="http://schemas.microsoft.com/office/word/2010/wordprocessingShape" mc:Ignorable="w14 w15 w16se w16cid w16 w16cex w16sdtdh w16sdtfl w16du wp14">
   <w:abstractNum w:abstractNumId="0" w15:restartNumberingAfterBreak="0">
+    <w:nsid w:val="020E76C5"/>
+    <w:multiLevelType w:val="hybridMultilevel"/>
+    <w:tmpl w:val="8D882A0C"/>
+    <w:lvl w:ilvl="0" w:tplc="40090001">
+      <w:start w:val="1"/>
+      <w:numFmt w:val="bullet"/>
+      <w:lvlText w:val=""/>
+      <w:lvlJc w:val="left"/>
+      <w:pPr>
+        <w:ind w:left="720" w:hanging="360"/>
+      </w:pPr>
+      <w:rPr>
+        <w:rFonts w:ascii="Symbol" w:hAnsi="Symbol" w:hint="default"/>
+      </w:rPr>
+    </w:lvl>
+    <w:lvl w:ilvl="1" w:tplc="40090003" w:tentative="1">
+      <w:start w:val="1"/>
+      <w:numFmt w:val="bullet"/>
+      <w:lvlText w:val="o"/>
+      <w:lvlJc w:val="left"/>
+      <w:pPr>
+        <w:ind w:left="1440" w:hanging="360"/>
+      </w:pPr>
+      <w:rPr>
+        <w:rFonts w:ascii="Courier New" w:hAnsi="Courier New" w:cs="Courier New" w:hint="default"/>
+      </w:rPr>
+    </w:lvl>
+    <w:lvl w:ilvl="2" w:tplc="40090005" w:tentative="1">
+      <w:start w:val="1"/>
+      <w:numFmt w:val="bullet"/>
+      <w:lvlText w:val=""/>
+      <w:lvlJc w:val="left"/>
+      <w:pPr>
+        <w:ind w:left="2160" w:hanging="360"/>
+      </w:pPr>
+      <w:rPr>
+        <w:rFonts w:ascii="Wingdings" w:hAnsi="Wingdings" w:hint="default"/>
+      </w:rPr>
+    </w:lvl>
+    <w:lvl w:ilvl="3" w:tplc="40090001" w:tentative="1">
+      <w:start w:val="1"/>
+      <w:numFmt w:val="bullet"/>
+      <w:lvlText w:val=""/>
+      <w:lvlJc w:val="left"/>
+      <w:pPr>
+        <w:ind w:left="2880" w:hanging="360"/>
+      </w:pPr>
+      <w:rPr>
+        <w:rFonts w:ascii="Symbol" w:hAnsi="Symbol" w:hint="default"/>
+      </w:rPr>
+    </w:lvl>
+    <w:lvl w:ilvl="4" w:tplc="40090003" w:tentative="1">
+      <w:start w:val="1"/>
+      <w:numFmt w:val="bullet"/>
+      <w:lvlText w:val="o"/>
+      <w:lvlJc w:val="left"/>
+      <w:pPr>
+        <w:ind w:left="3600" w:hanging="360"/>
+      </w:pPr>
+      <w:rPr>
+        <w:rFonts w:ascii="Courier New" w:hAnsi="Courier New" w:cs="Courier New" w:hint="default"/>
+      </w:rPr>
+    </w:lvl>
+    <w:lvl w:ilvl="5" w:tplc="40090005" w:tentative="1">
+      <w:start w:val="1"/>
+      <w:numFmt w:val="bullet"/>
+      <w:lvlText w:val=""/>
+      <w:lvlJc w:val="left"/>
+      <w:pPr>
+        <w:ind w:left="4320" w:hanging="360"/>
+      </w:pPr>
+      <w:rPr>
+        <w:rFonts w:ascii="Wingdings" w:hAnsi="Wingdings" w:hint="default"/>
+      </w:rPr>
+    </w:lvl>
+    <w:lvl w:ilvl="6" w:tplc="40090001" w:tentative="1">
+      <w:start w:val="1"/>
+      <w:numFmt w:val="bullet"/>
+      <w:lvlText w:val=""/>
+      <w:lvlJc w:val="left"/>
+      <w:pPr>
+        <w:ind w:left="5040" w:hanging="360"/>
+      </w:pPr>
+      <w:rPr>
+        <w:rFonts w:ascii="Symbol" w:hAnsi="Symbol" w:hint="default"/>
+      </w:rPr>
+    </w:lvl>
+    <w:lvl w:ilvl="7" w:tplc="40090003" w:tentative="1">
+      <w:start w:val="1"/>
+      <w:numFmt w:val="bullet"/>
+      <w:lvlText w:val="o"/>
+      <w:lvlJc w:val="left"/>
+      <w:pPr>
+        <w:ind w:left="5760" w:hanging="360"/>
+      </w:pPr>
+      <w:rPr>
+        <w:rFonts w:ascii="Courier New" w:hAnsi="Courier New" w:cs="Courier New" w:hint="default"/>
+      </w:rPr>
+    </w:lvl>
+    <w:lvl w:ilvl="8" w:tplc="40090005" w:tentative="1">
+      <w:start w:val="1"/>
+      <w:numFmt w:val="bullet"/>
+      <w:lvlText w:val=""/>
+      <w:lvlJc w:val="left"/>
+      <w:pPr>
+        <w:ind w:left="6480" w:hanging="360"/>
+      </w:pPr>
+      <w:rPr>
+        <w:rFonts w:ascii="Wingdings" w:hAnsi="Wingdings" w:hint="default"/>
+      </w:rPr>
+    </w:lvl>
+  </w:abstractNum>
+  <w:abstractNum w:abstractNumId="1" w15:restartNumberingAfterBreak="0">
     <w:nsid w:val="053870FE"/>
     <w:multiLevelType w:val="multilevel"/>
     <w:tmpl w:val="2D1E659A"/>
@@ -2479,7 +5699,7 @@
       </w:rPr>
     </w:lvl>
   </w:abstractNum>
-  <w:abstractNum w:abstractNumId="1" w15:restartNumberingAfterBreak="0">
+  <w:abstractNum w:abstractNumId="2" w15:restartNumberingAfterBreak="0">
     <w:nsid w:val="069C3A34"/>
     <w:multiLevelType w:val="multilevel"/>
     <w:tmpl w:val="175A4762"/>
@@ -2628,7 +5848,7 @@
       </w:rPr>
     </w:lvl>
   </w:abstractNum>
-  <w:abstractNum w:abstractNumId="2" w15:restartNumberingAfterBreak="0">
+  <w:abstractNum w:abstractNumId="3" w15:restartNumberingAfterBreak="0">
     <w:nsid w:val="0E2A1832"/>
     <w:multiLevelType w:val="multilevel"/>
     <w:tmpl w:val="C162655A"/>
@@ -2777,7 +5997,7 @@
       </w:rPr>
     </w:lvl>
   </w:abstractNum>
-  <w:abstractNum w:abstractNumId="3" w15:restartNumberingAfterBreak="0">
+  <w:abstractNum w:abstractNumId="4" w15:restartNumberingAfterBreak="0">
     <w:nsid w:val="25B12B89"/>
     <w:multiLevelType w:val="multilevel"/>
     <w:tmpl w:val="CD4C5CAC"/>
@@ -2890,7 +6110,156 @@
       </w:pPr>
     </w:lvl>
   </w:abstractNum>
-  <w:abstractNum w:abstractNumId="4" w15:restartNumberingAfterBreak="0">
+  <w:abstractNum w:abstractNumId="5" w15:restartNumberingAfterBreak="0">
+    <w:nsid w:val="447C13CC"/>
+    <w:multiLevelType w:val="multilevel"/>
+    <w:tmpl w:val="8C38E272"/>
+    <w:lvl w:ilvl="0">
+      <w:start w:val="1"/>
+      <w:numFmt w:val="bullet"/>
+      <w:lvlText w:val=""/>
+      <w:lvlJc w:val="left"/>
+      <w:pPr>
+        <w:tabs>
+          <w:tab w:val="num" w:pos="720"/>
+        </w:tabs>
+        <w:ind w:left="720" w:hanging="360"/>
+      </w:pPr>
+      <w:rPr>
+        <w:rFonts w:ascii="Symbol" w:hAnsi="Symbol" w:hint="default"/>
+        <w:sz w:val="20"/>
+      </w:rPr>
+    </w:lvl>
+    <w:lvl w:ilvl="1" w:tentative="1">
+      <w:start w:val="1"/>
+      <w:numFmt w:val="bullet"/>
+      <w:lvlText w:val="o"/>
+      <w:lvlJc w:val="left"/>
+      <w:pPr>
+        <w:tabs>
+          <w:tab w:val="num" w:pos="1440"/>
+        </w:tabs>
+        <w:ind w:left="1440" w:hanging="360"/>
+      </w:pPr>
+      <w:rPr>
+        <w:rFonts w:ascii="Courier New" w:hAnsi="Courier New" w:hint="default"/>
+        <w:sz w:val="20"/>
+      </w:rPr>
+    </w:lvl>
+    <w:lvl w:ilvl="2" w:tentative="1">
+      <w:start w:val="1"/>
+      <w:numFmt w:val="bullet"/>
+      <w:lvlText w:val=""/>
+      <w:lvlJc w:val="left"/>
+      <w:pPr>
+        <w:tabs>
+          <w:tab w:val="num" w:pos="2160"/>
+        </w:tabs>
+        <w:ind w:left="2160" w:hanging="360"/>
+      </w:pPr>
+      <w:rPr>
+        <w:rFonts w:ascii="Wingdings" w:hAnsi="Wingdings" w:hint="default"/>
+        <w:sz w:val="20"/>
+      </w:rPr>
+    </w:lvl>
+    <w:lvl w:ilvl="3" w:tentative="1">
+      <w:start w:val="1"/>
+      <w:numFmt w:val="bullet"/>
+      <w:lvlText w:val=""/>
+      <w:lvlJc w:val="left"/>
+      <w:pPr>
+        <w:tabs>
+          <w:tab w:val="num" w:pos="2880"/>
+        </w:tabs>
+        <w:ind w:left="2880" w:hanging="360"/>
+      </w:pPr>
+      <w:rPr>
+        <w:rFonts w:ascii="Wingdings" w:hAnsi="Wingdings" w:hint="default"/>
+        <w:sz w:val="20"/>
+      </w:rPr>
+    </w:lvl>
+    <w:lvl w:ilvl="4" w:tentative="1">
+      <w:start w:val="1"/>
+      <w:numFmt w:val="bullet"/>
+      <w:lvlText w:val=""/>
+      <w:lvlJc w:val="left"/>
+      <w:pPr>
+        <w:tabs>
+          <w:tab w:val="num" w:pos="3600"/>
+        </w:tabs>
+        <w:ind w:left="3600" w:hanging="360"/>
+      </w:pPr>
+      <w:rPr>
+        <w:rFonts w:ascii="Wingdings" w:hAnsi="Wingdings" w:hint="default"/>
+        <w:sz w:val="20"/>
+      </w:rPr>
+    </w:lvl>
+    <w:lvl w:ilvl="5" w:tentative="1">
+      <w:start w:val="1"/>
+      <w:numFmt w:val="bullet"/>
+      <w:lvlText w:val=""/>
+      <w:lvlJc w:val="left"/>
+      <w:pPr>
+        <w:tabs>
+          <w:tab w:val="num" w:pos="4320"/>
+        </w:tabs>
+        <w:ind w:left="4320" w:hanging="360"/>
+      </w:pPr>
+      <w:rPr>
+        <w:rFonts w:ascii="Wingdings" w:hAnsi="Wingdings" w:hint="default"/>
+        <w:sz w:val="20"/>
+      </w:rPr>
+    </w:lvl>
+    <w:lvl w:ilvl="6" w:tentative="1">
+      <w:start w:val="1"/>
+      <w:numFmt w:val="bullet"/>
+      <w:lvlText w:val=""/>
+      <w:lvlJc w:val="left"/>
+      <w:pPr>
+        <w:tabs>
+          <w:tab w:val="num" w:pos="5040"/>
+        </w:tabs>
+        <w:ind w:left="5040" w:hanging="360"/>
+      </w:pPr>
+      <w:rPr>
+        <w:rFonts w:ascii="Wingdings" w:hAnsi="Wingdings" w:hint="default"/>
+        <w:sz w:val="20"/>
+      </w:rPr>
+    </w:lvl>
+    <w:lvl w:ilvl="7" w:tentative="1">
+      <w:start w:val="1"/>
+      <w:numFmt w:val="bullet"/>
+      <w:lvlText w:val=""/>
+      <w:lvlJc w:val="left"/>
+      <w:pPr>
+        <w:tabs>
+          <w:tab w:val="num" w:pos="5760"/>
+        </w:tabs>
+        <w:ind w:left="5760" w:hanging="360"/>
+      </w:pPr>
+      <w:rPr>
+        <w:rFonts w:ascii="Wingdings" w:hAnsi="Wingdings" w:hint="default"/>
+        <w:sz w:val="20"/>
+      </w:rPr>
+    </w:lvl>
+    <w:lvl w:ilvl="8" w:tentative="1">
+      <w:start w:val="1"/>
+      <w:numFmt w:val="bullet"/>
+      <w:lvlText w:val=""/>
+      <w:lvlJc w:val="left"/>
+      <w:pPr>
+        <w:tabs>
+          <w:tab w:val="num" w:pos="6480"/>
+        </w:tabs>
+        <w:ind w:left="6480" w:hanging="360"/>
+      </w:pPr>
+      <w:rPr>
+        <w:rFonts w:ascii="Wingdings" w:hAnsi="Wingdings" w:hint="default"/>
+        <w:sz w:val="20"/>
+      </w:rPr>
+    </w:lvl>
+  </w:abstractNum>
+  <w:abstractNum w:abstractNumId="6" w15:restartNumberingAfterBreak="0">
     <w:nsid w:val="56791842"/>
     <w:multiLevelType w:val="multilevel"/>
     <w:tmpl w:val="B6EC22A8"/>
@@ -3039,7 +6408,7 @@
       </w:rPr>
     </w:lvl>
   </w:abstractNum>
-  <w:abstractNum w:abstractNumId="5" w15:restartNumberingAfterBreak="0">
+  <w:abstractNum w:abstractNumId="7" w15:restartNumberingAfterBreak="0">
     <w:nsid w:val="56EA1C95"/>
     <w:multiLevelType w:val="multilevel"/>
     <w:tmpl w:val="8C38E272"/>
@@ -3188,23 +6557,485 @@
       </w:rPr>
     </w:lvl>
   </w:abstractNum>
+  <w:abstractNum w:abstractNumId="8" w15:restartNumberingAfterBreak="0">
+    <w:nsid w:val="5D2D4280"/>
+    <w:multiLevelType w:val="multilevel"/>
+    <w:tmpl w:val="8C38E272"/>
+    <w:lvl w:ilvl="0">
+      <w:start w:val="1"/>
+      <w:numFmt w:val="bullet"/>
+      <w:lvlText w:val=""/>
+      <w:lvlJc w:val="left"/>
+      <w:pPr>
+        <w:tabs>
+          <w:tab w:val="num" w:pos="720"/>
+        </w:tabs>
+        <w:ind w:left="720" w:hanging="360"/>
+      </w:pPr>
+      <w:rPr>
+        <w:rFonts w:ascii="Symbol" w:hAnsi="Symbol" w:hint="default"/>
+        <w:sz w:val="20"/>
+      </w:rPr>
+    </w:lvl>
+    <w:lvl w:ilvl="1" w:tentative="1">
+      <w:start w:val="1"/>
+      <w:numFmt w:val="bullet"/>
+      <w:lvlText w:val="o"/>
+      <w:lvlJc w:val="left"/>
+      <w:pPr>
+        <w:tabs>
+          <w:tab w:val="num" w:pos="1440"/>
+        </w:tabs>
+        <w:ind w:left="1440" w:hanging="360"/>
+      </w:pPr>
+      <w:rPr>
+        <w:rFonts w:ascii="Courier New" w:hAnsi="Courier New" w:hint="default"/>
+        <w:sz w:val="20"/>
+      </w:rPr>
+    </w:lvl>
+    <w:lvl w:ilvl="2" w:tentative="1">
+      <w:start w:val="1"/>
+      <w:numFmt w:val="bullet"/>
+      <w:lvlText w:val=""/>
+      <w:lvlJc w:val="left"/>
+      <w:pPr>
+        <w:tabs>
+          <w:tab w:val="num" w:pos="2160"/>
+        </w:tabs>
+        <w:ind w:left="2160" w:hanging="360"/>
+      </w:pPr>
+      <w:rPr>
+        <w:rFonts w:ascii="Wingdings" w:hAnsi="Wingdings" w:hint="default"/>
+        <w:sz w:val="20"/>
+      </w:rPr>
+    </w:lvl>
+    <w:lvl w:ilvl="3" w:tentative="1">
+      <w:start w:val="1"/>
+      <w:numFmt w:val="bullet"/>
+      <w:lvlText w:val=""/>
+      <w:lvlJc w:val="left"/>
+      <w:pPr>
+        <w:tabs>
+          <w:tab w:val="num" w:pos="2880"/>
+        </w:tabs>
+        <w:ind w:left="2880" w:hanging="360"/>
+      </w:pPr>
+      <w:rPr>
+        <w:rFonts w:ascii="Wingdings" w:hAnsi="Wingdings" w:hint="default"/>
+        <w:sz w:val="20"/>
+      </w:rPr>
+    </w:lvl>
+    <w:lvl w:ilvl="4" w:tentative="1">
+      <w:start w:val="1"/>
+      <w:numFmt w:val="bullet"/>
+      <w:lvlText w:val=""/>
+      <w:lvlJc w:val="left"/>
+      <w:pPr>
+        <w:tabs>
+          <w:tab w:val="num" w:pos="3600"/>
+        </w:tabs>
+        <w:ind w:left="3600" w:hanging="360"/>
+      </w:pPr>
+      <w:rPr>
+        <w:rFonts w:ascii="Wingdings" w:hAnsi="Wingdings" w:hint="default"/>
+        <w:sz w:val="20"/>
+      </w:rPr>
+    </w:lvl>
+    <w:lvl w:ilvl="5" w:tentative="1">
+      <w:start w:val="1"/>
+      <w:numFmt w:val="bullet"/>
+      <w:lvlText w:val=""/>
+      <w:lvlJc w:val="left"/>
+      <w:pPr>
+        <w:tabs>
+          <w:tab w:val="num" w:pos="4320"/>
+        </w:tabs>
+        <w:ind w:left="4320" w:hanging="360"/>
+      </w:pPr>
+      <w:rPr>
+        <w:rFonts w:ascii="Wingdings" w:hAnsi="Wingdings" w:hint="default"/>
+        <w:sz w:val="20"/>
+      </w:rPr>
+    </w:lvl>
+    <w:lvl w:ilvl="6" w:tentative="1">
+      <w:start w:val="1"/>
+      <w:numFmt w:val="bullet"/>
+      <w:lvlText w:val=""/>
+      <w:lvlJc w:val="left"/>
+      <w:pPr>
+        <w:tabs>
+          <w:tab w:val="num" w:pos="5040"/>
+        </w:tabs>
+        <w:ind w:left="5040" w:hanging="360"/>
+      </w:pPr>
+      <w:rPr>
+        <w:rFonts w:ascii="Wingdings" w:hAnsi="Wingdings" w:hint="default"/>
+        <w:sz w:val="20"/>
+      </w:rPr>
+    </w:lvl>
+    <w:lvl w:ilvl="7" w:tentative="1">
+      <w:start w:val="1"/>
+      <w:numFmt w:val="bullet"/>
+      <w:lvlText w:val=""/>
+      <w:lvlJc w:val="left"/>
+      <w:pPr>
+        <w:tabs>
+          <w:tab w:val="num" w:pos="5760"/>
+        </w:tabs>
+        <w:ind w:left="5760" w:hanging="360"/>
+      </w:pPr>
+      <w:rPr>
+        <w:rFonts w:ascii="Wingdings" w:hAnsi="Wingdings" w:hint="default"/>
+        <w:sz w:val="20"/>
+      </w:rPr>
+    </w:lvl>
+    <w:lvl w:ilvl="8" w:tentative="1">
+      <w:start w:val="1"/>
+      <w:numFmt w:val="bullet"/>
+      <w:lvlText w:val=""/>
+      <w:lvlJc w:val="left"/>
+      <w:pPr>
+        <w:tabs>
+          <w:tab w:val="num" w:pos="6480"/>
+        </w:tabs>
+        <w:ind w:left="6480" w:hanging="360"/>
+      </w:pPr>
+      <w:rPr>
+        <w:rFonts w:ascii="Wingdings" w:hAnsi="Wingdings" w:hint="default"/>
+        <w:sz w:val="20"/>
+      </w:rPr>
+    </w:lvl>
+  </w:abstractNum>
+  <w:abstractNum w:abstractNumId="9" w15:restartNumberingAfterBreak="0">
+    <w:nsid w:val="5DD73C5A"/>
+    <w:multiLevelType w:val="multilevel"/>
+    <w:tmpl w:val="8C38E272"/>
+    <w:lvl w:ilvl="0">
+      <w:start w:val="1"/>
+      <w:numFmt w:val="bullet"/>
+      <w:lvlText w:val=""/>
+      <w:lvlJc w:val="left"/>
+      <w:pPr>
+        <w:tabs>
+          <w:tab w:val="num" w:pos="720"/>
+        </w:tabs>
+        <w:ind w:left="720" w:hanging="360"/>
+      </w:pPr>
+      <w:rPr>
+        <w:rFonts w:ascii="Symbol" w:hAnsi="Symbol" w:hint="default"/>
+        <w:sz w:val="20"/>
+      </w:rPr>
+    </w:lvl>
+    <w:lvl w:ilvl="1" w:tentative="1">
+      <w:start w:val="1"/>
+      <w:numFmt w:val="bullet"/>
+      <w:lvlText w:val="o"/>
+      <w:lvlJc w:val="left"/>
+      <w:pPr>
+        <w:tabs>
+          <w:tab w:val="num" w:pos="1440"/>
+        </w:tabs>
+        <w:ind w:left="1440" w:hanging="360"/>
+      </w:pPr>
+      <w:rPr>
+        <w:rFonts w:ascii="Courier New" w:hAnsi="Courier New" w:hint="default"/>
+        <w:sz w:val="20"/>
+      </w:rPr>
+    </w:lvl>
+    <w:lvl w:ilvl="2" w:tentative="1">
+      <w:start w:val="1"/>
+      <w:numFmt w:val="bullet"/>
+      <w:lvlText w:val=""/>
+      <w:lvlJc w:val="left"/>
+      <w:pPr>
+        <w:tabs>
+          <w:tab w:val="num" w:pos="2160"/>
+        </w:tabs>
+        <w:ind w:left="2160" w:hanging="360"/>
+      </w:pPr>
+      <w:rPr>
+        <w:rFonts w:ascii="Wingdings" w:hAnsi="Wingdings" w:hint="default"/>
+        <w:sz w:val="20"/>
+      </w:rPr>
+    </w:lvl>
+    <w:lvl w:ilvl="3" w:tentative="1">
+      <w:start w:val="1"/>
+      <w:numFmt w:val="bullet"/>
+      <w:lvlText w:val=""/>
+      <w:lvlJc w:val="left"/>
+      <w:pPr>
+        <w:tabs>
+          <w:tab w:val="num" w:pos="2880"/>
+        </w:tabs>
+        <w:ind w:left="2880" w:hanging="360"/>
+      </w:pPr>
+      <w:rPr>
+        <w:rFonts w:ascii="Wingdings" w:hAnsi="Wingdings" w:hint="default"/>
+        <w:sz w:val="20"/>
+      </w:rPr>
+    </w:lvl>
+    <w:lvl w:ilvl="4" w:tentative="1">
+      <w:start w:val="1"/>
+      <w:numFmt w:val="bullet"/>
+      <w:lvlText w:val=""/>
+      <w:lvlJc w:val="left"/>
+      <w:pPr>
+        <w:tabs>
+          <w:tab w:val="num" w:pos="3600"/>
+        </w:tabs>
+        <w:ind w:left="3600" w:hanging="360"/>
+      </w:pPr>
+      <w:rPr>
+        <w:rFonts w:ascii="Wingdings" w:hAnsi="Wingdings" w:hint="default"/>
+        <w:sz w:val="20"/>
+      </w:rPr>
+    </w:lvl>
+    <w:lvl w:ilvl="5" w:tentative="1">
+      <w:start w:val="1"/>
+      <w:numFmt w:val="bullet"/>
+      <w:lvlText w:val=""/>
+      <w:lvlJc w:val="left"/>
+      <w:pPr>
+        <w:tabs>
+          <w:tab w:val="num" w:pos="4320"/>
+        </w:tabs>
+        <w:ind w:left="4320" w:hanging="360"/>
+      </w:pPr>
+      <w:rPr>
+        <w:rFonts w:ascii="Wingdings" w:hAnsi="Wingdings" w:hint="default"/>
+        <w:sz w:val="20"/>
+      </w:rPr>
+    </w:lvl>
+    <w:lvl w:ilvl="6" w:tentative="1">
+      <w:start w:val="1"/>
+      <w:numFmt w:val="bullet"/>
+      <w:lvlText w:val=""/>
+      <w:lvlJc w:val="left"/>
+      <w:pPr>
+        <w:tabs>
+          <w:tab w:val="num" w:pos="5040"/>
+        </w:tabs>
+        <w:ind w:left="5040" w:hanging="360"/>
+      </w:pPr>
+      <w:rPr>
+        <w:rFonts w:ascii="Wingdings" w:hAnsi="Wingdings" w:hint="default"/>
+        <w:sz w:val="20"/>
+      </w:rPr>
+    </w:lvl>
+    <w:lvl w:ilvl="7" w:tentative="1">
+      <w:start w:val="1"/>
+      <w:numFmt w:val="bullet"/>
+      <w:lvlText w:val=""/>
+      <w:lvlJc w:val="left"/>
+      <w:pPr>
+        <w:tabs>
+          <w:tab w:val="num" w:pos="5760"/>
+        </w:tabs>
+        <w:ind w:left="5760" w:hanging="360"/>
+      </w:pPr>
+      <w:rPr>
+        <w:rFonts w:ascii="Wingdings" w:hAnsi="Wingdings" w:hint="default"/>
+        <w:sz w:val="20"/>
+      </w:rPr>
+    </w:lvl>
+    <w:lvl w:ilvl="8" w:tentative="1">
+      <w:start w:val="1"/>
+      <w:numFmt w:val="bullet"/>
+      <w:lvlText w:val=""/>
+      <w:lvlJc w:val="left"/>
+      <w:pPr>
+        <w:tabs>
+          <w:tab w:val="num" w:pos="6480"/>
+        </w:tabs>
+        <w:ind w:left="6480" w:hanging="360"/>
+      </w:pPr>
+      <w:rPr>
+        <w:rFonts w:ascii="Wingdings" w:hAnsi="Wingdings" w:hint="default"/>
+        <w:sz w:val="20"/>
+      </w:rPr>
+    </w:lvl>
+  </w:abstractNum>
+  <w:abstractNum w:abstractNumId="10" w15:restartNumberingAfterBreak="0">
+    <w:nsid w:val="74C5056F"/>
+    <w:multiLevelType w:val="multilevel"/>
+    <w:tmpl w:val="8C38E272"/>
+    <w:lvl w:ilvl="0">
+      <w:start w:val="1"/>
+      <w:numFmt w:val="bullet"/>
+      <w:lvlText w:val=""/>
+      <w:lvlJc w:val="left"/>
+      <w:pPr>
+        <w:tabs>
+          <w:tab w:val="num" w:pos="720"/>
+        </w:tabs>
+        <w:ind w:left="720" w:hanging="360"/>
+      </w:pPr>
+      <w:rPr>
+        <w:rFonts w:ascii="Symbol" w:hAnsi="Symbol" w:hint="default"/>
+        <w:sz w:val="20"/>
+      </w:rPr>
+    </w:lvl>
+    <w:lvl w:ilvl="1" w:tentative="1">
+      <w:start w:val="1"/>
+      <w:numFmt w:val="bullet"/>
+      <w:lvlText w:val="o"/>
+      <w:lvlJc w:val="left"/>
+      <w:pPr>
+        <w:tabs>
+          <w:tab w:val="num" w:pos="1440"/>
+        </w:tabs>
+        <w:ind w:left="1440" w:hanging="360"/>
+      </w:pPr>
+      <w:rPr>
+        <w:rFonts w:ascii="Courier New" w:hAnsi="Courier New" w:hint="default"/>
+        <w:sz w:val="20"/>
+      </w:rPr>
+    </w:lvl>
+    <w:lvl w:ilvl="2" w:tentative="1">
+      <w:start w:val="1"/>
+      <w:numFmt w:val="bullet"/>
+      <w:lvlText w:val=""/>
+      <w:lvlJc w:val="left"/>
+      <w:pPr>
+        <w:tabs>
+          <w:tab w:val="num" w:pos="2160"/>
+        </w:tabs>
+        <w:ind w:left="2160" w:hanging="360"/>
+      </w:pPr>
+      <w:rPr>
+        <w:rFonts w:ascii="Wingdings" w:hAnsi="Wingdings" w:hint="default"/>
+        <w:sz w:val="20"/>
+      </w:rPr>
+    </w:lvl>
+    <w:lvl w:ilvl="3" w:tentative="1">
+      <w:start w:val="1"/>
+      <w:numFmt w:val="bullet"/>
+      <w:lvlText w:val=""/>
+      <w:lvlJc w:val="left"/>
+      <w:pPr>
+        <w:tabs>
+          <w:tab w:val="num" w:pos="2880"/>
+        </w:tabs>
+        <w:ind w:left="2880" w:hanging="360"/>
+      </w:pPr>
+      <w:rPr>
+        <w:rFonts w:ascii="Wingdings" w:hAnsi="Wingdings" w:hint="default"/>
+        <w:sz w:val="20"/>
+      </w:rPr>
+    </w:lvl>
+    <w:lvl w:ilvl="4" w:tentative="1">
+      <w:start w:val="1"/>
+      <w:numFmt w:val="bullet"/>
+      <w:lvlText w:val=""/>
+      <w:lvlJc w:val="left"/>
+      <w:pPr>
+        <w:tabs>
+          <w:tab w:val="num" w:pos="3600"/>
+        </w:tabs>
+        <w:ind w:left="3600" w:hanging="360"/>
+      </w:pPr>
+      <w:rPr>
+        <w:rFonts w:ascii="Wingdings" w:hAnsi="Wingdings" w:hint="default"/>
+        <w:sz w:val="20"/>
+      </w:rPr>
+    </w:lvl>
+    <w:lvl w:ilvl="5" w:tentative="1">
+      <w:start w:val="1"/>
+      <w:numFmt w:val="bullet"/>
+      <w:lvlText w:val=""/>
+      <w:lvlJc w:val="left"/>
+      <w:pPr>
+        <w:tabs>
+          <w:tab w:val="num" w:pos="4320"/>
+        </w:tabs>
+        <w:ind w:left="4320" w:hanging="360"/>
+      </w:pPr>
+      <w:rPr>
+        <w:rFonts w:ascii="Wingdings" w:hAnsi="Wingdings" w:hint="default"/>
+        <w:sz w:val="20"/>
+      </w:rPr>
+    </w:lvl>
+    <w:lvl w:ilvl="6" w:tentative="1">
+      <w:start w:val="1"/>
+      <w:numFmt w:val="bullet"/>
+      <w:lvlText w:val=""/>
+      <w:lvlJc w:val="left"/>
+      <w:pPr>
+        <w:tabs>
+          <w:tab w:val="num" w:pos="5040"/>
+        </w:tabs>
+        <w:ind w:left="5040" w:hanging="360"/>
+      </w:pPr>
+      <w:rPr>
+        <w:rFonts w:ascii="Wingdings" w:hAnsi="Wingdings" w:hint="default"/>
+        <w:sz w:val="20"/>
+      </w:rPr>
+    </w:lvl>
+    <w:lvl w:ilvl="7" w:tentative="1">
+      <w:start w:val="1"/>
+      <w:numFmt w:val="bullet"/>
+      <w:lvlText w:val=""/>
+      <w:lvlJc w:val="left"/>
+      <w:pPr>
+        <w:tabs>
+          <w:tab w:val="num" w:pos="5760"/>
+        </w:tabs>
+        <w:ind w:left="5760" w:hanging="360"/>
+      </w:pPr>
+      <w:rPr>
+        <w:rFonts w:ascii="Wingdings" w:hAnsi="Wingdings" w:hint="default"/>
+        <w:sz w:val="20"/>
+      </w:rPr>
+    </w:lvl>
+    <w:lvl w:ilvl="8" w:tentative="1">
+      <w:start w:val="1"/>
+      <w:numFmt w:val="bullet"/>
+      <w:lvlText w:val=""/>
+      <w:lvlJc w:val="left"/>
+      <w:pPr>
+        <w:tabs>
+          <w:tab w:val="num" w:pos="6480"/>
+        </w:tabs>
+        <w:ind w:left="6480" w:hanging="360"/>
+      </w:pPr>
+      <w:rPr>
+        <w:rFonts w:ascii="Wingdings" w:hAnsi="Wingdings" w:hint="default"/>
+        <w:sz w:val="20"/>
+      </w:rPr>
+    </w:lvl>
+  </w:abstractNum>
   <w:num w:numId="1" w16cid:durableId="215552623">
+    <w:abstractNumId w:val="1"/>
+  </w:num>
+  <w:num w:numId="2" w16cid:durableId="141578431">
+    <w:abstractNumId w:val="6"/>
+  </w:num>
+  <w:num w:numId="3" w16cid:durableId="116073754">
+    <w:abstractNumId w:val="2"/>
+  </w:num>
+  <w:num w:numId="4" w16cid:durableId="1400398451">
+    <w:abstractNumId w:val="3"/>
+  </w:num>
+  <w:num w:numId="5" w16cid:durableId="1128399807">
+    <w:abstractNumId w:val="4"/>
+  </w:num>
+  <w:num w:numId="6" w16cid:durableId="2054771008">
+    <w:abstractNumId w:val="7"/>
+  </w:num>
+  <w:num w:numId="7" w16cid:durableId="777530066">
     <w:abstractNumId w:val="0"/>
   </w:num>
-  <w:num w:numId="2" w16cid:durableId="141578431">
-    <w:abstractNumId w:val="4"/>
+  <w:num w:numId="8" w16cid:durableId="1537155846">
+    <w:abstractNumId w:val="8"/>
   </w:num>
-  <w:num w:numId="3" w16cid:durableId="116073754">
-    <w:abstractNumId w:val="1"/>
+  <w:num w:numId="9" w16cid:durableId="2095855532">
+    <w:abstractNumId w:val="9"/>
   </w:num>
-  <w:num w:numId="4" w16cid:durableId="1400398451">
-    <w:abstractNumId w:val="2"/>
+  <w:num w:numId="10" w16cid:durableId="479269931">
+    <w:abstractNumId w:val="5"/>
   </w:num>
-  <w:num w:numId="5" w16cid:durableId="1128399807">
-    <w:abstractNumId w:val="3"/>
-  </w:num>
-  <w:num w:numId="6" w16cid:durableId="2054771008">
-    <w:abstractNumId w:val="5"/>
+  <w:num w:numId="11" w16cid:durableId="900099449">
+    <w:abstractNumId w:val="10"/>
   </w:num>
 </w:numbering>
 </file>

</xml_diff>